<commit_message>
Histoire T8 : unité 7 style T5 — patrimoines culturels et historiques (2 séances, docs : convention UNESCO 1972, ordonnance 82-029)
Co-authored-by: arena-agent <297053741+arena-agent@users.noreply.github.com>
</commit_message>
<xml_diff>
--- a/manuel-histoire-t8/Manuel_Histoire_T8_UNITE7.docx
+++ b/manuel-histoire-t8/Manuel_Histoire_T8_UNITE7.docx
@@ -1819,152 +1819,152 @@
                 <w:szCs w:val="20"/>
                 <w:rFonts w:ascii="Times New Roman" w:cs="Times New Roman" w:eastAsia="Times New Roman" w:hAnsi="Times New Roman"/>
               </w:rPr>
-              <w:t xml:space="preserve">3. Observation</w:t>
-            </w:r>
-          </w:p>
-        </w:tc>
-        <w:tc>
-          <w:tcPr>
-            <w:tcMar>
-              <w:top w:type="dxa" w:w="80"/>
-              <w:left w:type="dxa" w:w="80"/>
-              <w:bottom w:type="dxa" w:w="80"/>
-              <w:right w:type="dxa" w:w="80"/>
-            </w:tcMar>
-          </w:tcPr>
-          <w:p>
-            <w:pPr>
-              <w:spacing w:after="40"/>
-              <w:jc w:val="left"/>
-            </w:pPr>
-            <w:r>
-              <w:rPr>
-                <w:b w:val="false"/>
-                <w:bCs w:val="false"/>
-                <w:i w:val="false"/>
-                <w:iCs w:val="false"/>
-                <w:color w:val="000000"/>
-                <w:sz w:val="20"/>
-                <w:szCs w:val="20"/>
-                <w:rFonts w:ascii="Times New Roman" w:cs="Times New Roman" w:eastAsia="Times New Roman" w:hAnsi="Times New Roman"/>
-              </w:rPr>
-              <w:t xml:space="preserve">Classe : le Rova (monument → matériel), un ohabolana (tradition orale → immatériel), un sorabe (document → matériel), le hiragasy (art du spectacle → immatériel), les terrasses betsileo (paysage construit → matériel).</w:t>
-            </w:r>
-          </w:p>
-        </w:tc>
-        <w:tc>
-          <w:tcPr>
-            <w:tcMar>
-              <w:top w:type="dxa" w:w="80"/>
-              <w:left w:type="dxa" w:w="80"/>
-              <w:bottom w:type="dxa" w:w="80"/>
-              <w:right w:type="dxa" w:w="80"/>
-            </w:tcMar>
-          </w:tcPr>
-          <w:p>
-            <w:pPr>
-              <w:spacing w:after="40"/>
-              <w:jc w:val="left"/>
-            </w:pPr>
-            <w:r>
-              <w:rPr>
-                <w:b w:val="false"/>
-                <w:bCs w:val="false"/>
-                <w:i w:val="false"/>
-                <w:iCs w:val="false"/>
-                <w:color w:val="000000"/>
-                <w:sz w:val="20"/>
-                <w:szCs w:val="20"/>
-                <w:rFonts w:ascii="Times New Roman" w:cs="Times New Roman" w:eastAsia="Times New Roman" w:hAnsi="Times New Roman"/>
-              </w:rPr>
-              <w:t xml:space="preserve">Observent l’exemple résolu.</w:t>
-            </w:r>
-          </w:p>
-        </w:tc>
-        <w:tc>
-          <w:tcPr>
-            <w:tcMar>
-              <w:top w:type="dxa" w:w="80"/>
-              <w:left w:type="dxa" w:w="80"/>
-              <w:bottom w:type="dxa" w:w="80"/>
-              <w:right w:type="dxa" w:w="80"/>
-            </w:tcMar>
-          </w:tcPr>
-          <w:p>
-            <w:pPr>
-              <w:spacing w:after="40"/>
-              <w:jc w:val="left"/>
-            </w:pPr>
-            <w:r>
-              <w:rPr>
-                <w:b w:val="false"/>
-                <w:bCs w:val="false"/>
-                <w:i w:val="false"/>
-                <w:iCs w:val="false"/>
-                <w:color w:val="000000"/>
-                <w:sz w:val="20"/>
-                <w:szCs w:val="20"/>
-                <w:rFonts w:ascii="Times New Roman" w:cs="Times New Roman" w:eastAsia="Times New Roman" w:hAnsi="Times New Roman"/>
-              </w:rPr>
-              <w:t xml:space="preserve">Observation dirigée</w:t>
-            </w:r>
-          </w:p>
-        </w:tc>
-        <w:tc>
-          <w:tcPr>
-            <w:tcMar>
-              <w:top w:type="dxa" w:w="80"/>
-              <w:left w:type="dxa" w:w="80"/>
-              <w:bottom w:type="dxa" w:w="80"/>
-              <w:right w:type="dxa" w:w="80"/>
-            </w:tcMar>
-          </w:tcPr>
-          <w:p>
-            <w:pPr>
-              <w:spacing w:after="40"/>
-              <w:jc w:val="left"/>
-            </w:pPr>
-            <w:r>
-              <w:rPr>
-                <w:b w:val="false"/>
-                <w:bCs w:val="false"/>
-                <w:i w:val="false"/>
-                <w:iCs w:val="false"/>
-                <w:color w:val="000000"/>
-                <w:sz w:val="20"/>
-                <w:szCs w:val="20"/>
-                <w:rFonts w:ascii="Times New Roman" w:cs="Times New Roman" w:eastAsia="Times New Roman" w:hAnsi="Times New Roman"/>
-              </w:rPr>
-              <w:t xml:space="preserve">Document imprimé</w:t>
-            </w:r>
-          </w:p>
-        </w:tc>
-        <w:tc>
-          <w:tcPr>
-            <w:tcMar>
-              <w:top w:type="dxa" w:w="80"/>
-              <w:left w:type="dxa" w:w="80"/>
-              <w:bottom w:type="dxa" w:w="80"/>
-              <w:right w:type="dxa" w:w="80"/>
-            </w:tcMar>
-          </w:tcPr>
-          <w:p>
-            <w:pPr>
-              <w:spacing w:after="40"/>
-              <w:jc w:val="left"/>
-            </w:pPr>
-            <w:r>
-              <w:rPr>
-                <w:b w:val="false"/>
-                <w:bCs w:val="false"/>
-                <w:i w:val="false"/>
-                <w:iCs w:val="false"/>
-                <w:color w:val="000000"/>
-                <w:sz w:val="20"/>
-                <w:szCs w:val="20"/>
-                <w:rFonts w:ascii="Times New Roman" w:cs="Times New Roman" w:eastAsia="Times New Roman" w:hAnsi="Times New Roman"/>
-              </w:rPr>
-              <w:t xml:space="preserve">Compréhension</w:t>
+              <w:t xml:space="preserve">3. Développement</w:t>
+            </w:r>
+          </w:p>
+        </w:tc>
+        <w:tc>
+          <w:tcPr>
+            <w:tcMar>
+              <w:top w:type="dxa" w:w="80"/>
+              <w:left w:type="dxa" w:w="80"/>
+              <w:bottom w:type="dxa" w:w="80"/>
+              <w:right w:type="dxa" w:w="80"/>
+            </w:tcMar>
+          </w:tcPr>
+          <w:p>
+            <w:pPr>
+              <w:spacing w:after="40"/>
+              <w:jc w:val="left"/>
+            </w:pPr>
+            <w:r>
+              <w:rPr>
+                <w:b w:val="false"/>
+                <w:bCs w:val="false"/>
+                <w:i w:val="false"/>
+                <w:iCs w:val="false"/>
+                <w:color w:val="000000"/>
+                <w:sz w:val="20"/>
+                <w:szCs w:val="20"/>
+                <w:rFonts w:ascii="Times New Roman" w:cs="Times New Roman" w:eastAsia="Times New Roman" w:hAnsi="Times New Roman"/>
+              </w:rPr>
+              <w:t xml:space="preserve">Développe la leçon partie par partie : Qu’est-ce que le patrimoine ? ; Le patrimoine matériel : ce qui se touche ; Le patrimoine immatériel : ce qui se pratique ; Une reconnaissance mondiale.</w:t>
+            </w:r>
+          </w:p>
+        </w:tc>
+        <w:tc>
+          <w:tcPr>
+            <w:tcMar>
+              <w:top w:type="dxa" w:w="80"/>
+              <w:left w:type="dxa" w:w="80"/>
+              <w:bottom w:type="dxa" w:w="80"/>
+              <w:right w:type="dxa" w:w="80"/>
+            </w:tcMar>
+          </w:tcPr>
+          <w:p>
+            <w:pPr>
+              <w:spacing w:after="40"/>
+              <w:jc w:val="left"/>
+            </w:pPr>
+            <w:r>
+              <w:rPr>
+                <w:b w:val="false"/>
+                <w:bCs w:val="false"/>
+                <w:i w:val="false"/>
+                <w:iCs w:val="false"/>
+                <w:color w:val="000000"/>
+                <w:sz w:val="20"/>
+                <w:szCs w:val="20"/>
+                <w:rFonts w:ascii="Times New Roman" w:cs="Times New Roman" w:eastAsia="Times New Roman" w:hAnsi="Times New Roman"/>
+              </w:rPr>
+              <w:t xml:space="preserve">Écoutent, répondent aux questions et notent les mots-clés.</w:t>
+            </w:r>
+          </w:p>
+        </w:tc>
+        <w:tc>
+          <w:tcPr>
+            <w:tcMar>
+              <w:top w:type="dxa" w:w="80"/>
+              <w:left w:type="dxa" w:w="80"/>
+              <w:bottom w:type="dxa" w:w="80"/>
+              <w:right w:type="dxa" w:w="80"/>
+            </w:tcMar>
+          </w:tcPr>
+          <w:p>
+            <w:pPr>
+              <w:spacing w:after="40"/>
+              <w:jc w:val="left"/>
+            </w:pPr>
+            <w:r>
+              <w:rPr>
+                <w:b w:val="false"/>
+                <w:bCs w:val="false"/>
+                <w:i w:val="false"/>
+                <w:iCs w:val="false"/>
+                <w:color w:val="000000"/>
+                <w:sz w:val="20"/>
+                <w:szCs w:val="20"/>
+                <w:rFonts w:ascii="Times New Roman" w:cs="Times New Roman" w:eastAsia="Times New Roman" w:hAnsi="Times New Roman"/>
+              </w:rPr>
+              <w:t xml:space="preserve">Exposé interactif, questions-réponses</w:t>
+            </w:r>
+          </w:p>
+        </w:tc>
+        <w:tc>
+          <w:tcPr>
+            <w:tcMar>
+              <w:top w:type="dxa" w:w="80"/>
+              <w:left w:type="dxa" w:w="80"/>
+              <w:bottom w:type="dxa" w:w="80"/>
+              <w:right w:type="dxa" w:w="80"/>
+            </w:tcMar>
+          </w:tcPr>
+          <w:p>
+            <w:pPr>
+              <w:spacing w:after="40"/>
+              <w:jc w:val="left"/>
+            </w:pPr>
+            <w:r>
+              <w:rPr>
+                <w:b w:val="false"/>
+                <w:bCs w:val="false"/>
+                <w:i w:val="false"/>
+                <w:iCs w:val="false"/>
+                <w:color w:val="000000"/>
+                <w:sz w:val="20"/>
+                <w:szCs w:val="20"/>
+                <w:rFonts w:ascii="Times New Roman" w:cs="Times New Roman" w:eastAsia="Times New Roman" w:hAnsi="Times New Roman"/>
+              </w:rPr>
+              <w:t xml:space="preserve">Tableau, frises, cartes</w:t>
+            </w:r>
+          </w:p>
+        </w:tc>
+        <w:tc>
+          <w:tcPr>
+            <w:tcMar>
+              <w:top w:type="dxa" w:w="80"/>
+              <w:left w:type="dxa" w:w="80"/>
+              <w:bottom w:type="dxa" w:w="80"/>
+              <w:right w:type="dxa" w:w="80"/>
+            </w:tcMar>
+          </w:tcPr>
+          <w:p>
+            <w:pPr>
+              <w:spacing w:after="40"/>
+              <w:jc w:val="left"/>
+            </w:pPr>
+            <w:r>
+              <w:rPr>
+                <w:b w:val="false"/>
+                <w:bCs w:val="false"/>
+                <w:i w:val="false"/>
+                <w:iCs w:val="false"/>
+                <w:color w:val="000000"/>
+                <w:sz w:val="20"/>
+                <w:szCs w:val="20"/>
+                <w:rFonts w:ascii="Times New Roman" w:cs="Times New Roman" w:eastAsia="Times New Roman" w:hAnsi="Times New Roman"/>
+              </w:rPr>
+              <w:t xml:space="preserve">Attention, participation</w:t>
             </w:r>
           </w:p>
         </w:tc>
@@ -1995,152 +1995,152 @@
                 <w:szCs w:val="20"/>
                 <w:rFonts w:ascii="Times New Roman" w:cs="Times New Roman" w:eastAsia="Times New Roman" w:hAnsi="Times New Roman"/>
               </w:rPr>
-              <w:t xml:space="preserve">4. Analyse</w:t>
-            </w:r>
-          </w:p>
-        </w:tc>
-        <w:tc>
-          <w:tcPr>
-            <w:tcMar>
-              <w:top w:type="dxa" w:w="80"/>
-              <w:left w:type="dxa" w:w="80"/>
-              <w:bottom w:type="dxa" w:w="80"/>
-              <w:right w:type="dxa" w:w="80"/>
-            </w:tcMar>
-          </w:tcPr>
-          <w:p>
-            <w:pPr>
-              <w:spacing w:after="40"/>
-              <w:jc w:val="left"/>
-            </w:pPr>
-            <w:r>
-              <w:rPr>
-                <w:b w:val="false"/>
-                <w:bCs w:val="false"/>
-                <w:i w:val="false"/>
-                <w:iCs w:val="false"/>
-                <w:color w:val="000000"/>
-                <w:sz w:val="20"/>
-                <w:szCs w:val="20"/>
-                <w:rFonts w:ascii="Times New Roman" w:cs="Times New Roman" w:eastAsia="Times New Roman" w:hAnsi="Times New Roman"/>
-              </w:rPr>
-              <w:t xml:space="preserve">Guide l’analyse : Le mot patrimoine vient du latin patrimonium : « ce qui vient des pères » — l’héritage. Appliqué à la culture, il désigne tout ce qu’une communauté — village, région, nation, humanité — reçoit du passé, reconnaît comme précieux et décide de transmettre. Le patrimoine matériel de Madagascar est d’une grande richesse : des monuments comme le Rova d’Antananarivo ou les portes de pierre des villages fortifiés de l’Imerina ; des sites archéologiques, tels les anciens villages des Hautes Terres ou les comptoirs échangeurs de la côte ; des paysages construits — les rizières en terrasses betsileo, œuvre de générations ; des œuvres d’art, comme les aloalo funéraires mahafaly ; des documents, enfin : les sorabe en caractères arabes, les archives royales, les photographies anciennes. Le patrimoine immatériel est tout aussi précieux, mais fragile autrement : il ne vit que tant qu’on le pratique. Les traditions orales — contes (angano), proverbes (ohabolana), généalogies récitées ; les arts du spectacle — le hiragasy des Hautes Terres, les chants et musiques de chaque région ; les rituels et pratiques sociales — le famadihana, les cérémonies de circoncision, les kabary de mariage ; les fêtes — le fandroana d’autrefois, les fêtes de villages. L’UNESCO protège ces deux formes au niveau mondial : la colline royale d’Ambohimanga est classée patrimoine mondial (matériel), et le savoir-faire du bois des Zafimaniry comme le kabary malgache sont inscrits au patrimoine immatériel de l’humanité. Première mission du citoyen : connaître ce double trésor — on ne protège bien que ce qu’on connaît.</w:t>
-            </w:r>
-          </w:p>
-        </w:tc>
-        <w:tc>
-          <w:tcPr>
-            <w:tcMar>
-              <w:top w:type="dxa" w:w="80"/>
-              <w:left w:type="dxa" w:w="80"/>
-              <w:bottom w:type="dxa" w:w="80"/>
-              <w:right w:type="dxa" w:w="80"/>
-            </w:tcMar>
-          </w:tcPr>
-          <w:p>
-            <w:pPr>
-              <w:spacing w:after="40"/>
-              <w:jc w:val="left"/>
-            </w:pPr>
-            <w:r>
-              <w:rPr>
-                <w:b w:val="false"/>
-                <w:bCs w:val="false"/>
-                <w:i w:val="false"/>
-                <w:iCs w:val="false"/>
-                <w:color w:val="000000"/>
-                <w:sz w:val="20"/>
-                <w:szCs w:val="20"/>
-                <w:rFonts w:ascii="Times New Roman" w:cs="Times New Roman" w:eastAsia="Times New Roman" w:hAnsi="Times New Roman"/>
-              </w:rPr>
-              <w:t xml:space="preserve">Expliquent la démarche et vérifient le résultat.</w:t>
-            </w:r>
-          </w:p>
-        </w:tc>
-        <w:tc>
-          <w:tcPr>
-            <w:tcMar>
-              <w:top w:type="dxa" w:w="80"/>
-              <w:left w:type="dxa" w:w="80"/>
-              <w:bottom w:type="dxa" w:w="80"/>
-              <w:right w:type="dxa" w:w="80"/>
-            </w:tcMar>
-          </w:tcPr>
-          <w:p>
-            <w:pPr>
-              <w:spacing w:after="40"/>
-              <w:jc w:val="left"/>
-            </w:pPr>
-            <w:r>
-              <w:rPr>
-                <w:b w:val="false"/>
-                <w:bCs w:val="false"/>
-                <w:i w:val="false"/>
-                <w:iCs w:val="false"/>
-                <w:color w:val="000000"/>
-                <w:sz w:val="20"/>
-                <w:szCs w:val="20"/>
-                <w:rFonts w:ascii="Times New Roman" w:cs="Times New Roman" w:eastAsia="Times New Roman" w:hAnsi="Times New Roman"/>
-              </w:rPr>
-              <w:t xml:space="preserve">Recherche en binômes</w:t>
-            </w:r>
-          </w:p>
-        </w:tc>
-        <w:tc>
-          <w:tcPr>
-            <w:tcMar>
-              <w:top w:type="dxa" w:w="80"/>
-              <w:left w:type="dxa" w:w="80"/>
-              <w:bottom w:type="dxa" w:w="80"/>
-              <w:right w:type="dxa" w:w="80"/>
-            </w:tcMar>
-          </w:tcPr>
-          <w:p>
-            <w:pPr>
-              <w:spacing w:after="40"/>
-              <w:jc w:val="left"/>
-            </w:pPr>
-            <w:r>
-              <w:rPr>
-                <w:b w:val="false"/>
-                <w:bCs w:val="false"/>
-                <w:i w:val="false"/>
-                <w:iCs w:val="false"/>
-                <w:color w:val="000000"/>
-                <w:sz w:val="20"/>
-                <w:szCs w:val="20"/>
-                <w:rFonts w:ascii="Times New Roman" w:cs="Times New Roman" w:eastAsia="Times New Roman" w:hAnsi="Times New Roman"/>
-              </w:rPr>
-              <w:t xml:space="preserve">Documents, cartes, frises</w:t>
-            </w:r>
-          </w:p>
-        </w:tc>
-        <w:tc>
-          <w:tcPr>
-            <w:tcMar>
-              <w:top w:type="dxa" w:w="80"/>
-              <w:left w:type="dxa" w:w="80"/>
-              <w:bottom w:type="dxa" w:w="80"/>
-              <w:right w:type="dxa" w:w="80"/>
-            </w:tcMar>
-          </w:tcPr>
-          <w:p>
-            <w:pPr>
-              <w:spacing w:after="40"/>
-              <w:jc w:val="left"/>
-            </w:pPr>
-            <w:r>
-              <w:rPr>
-                <w:b w:val="false"/>
-                <w:bCs w:val="false"/>
-                <w:i w:val="false"/>
-                <w:iCs w:val="false"/>
-                <w:color w:val="000000"/>
-                <w:sz w:val="20"/>
-                <w:szCs w:val="20"/>
-                <w:rFonts w:ascii="Times New Roman" w:cs="Times New Roman" w:eastAsia="Times New Roman" w:hAnsi="Times New Roman"/>
-              </w:rPr>
-              <w:t xml:space="preserve">Raisonnement</w:t>
+              <w:t xml:space="preserve">4. Étude de document</w:t>
+            </w:r>
+          </w:p>
+        </w:tc>
+        <w:tc>
+          <w:tcPr>
+            <w:tcMar>
+              <w:top w:type="dxa" w:w="80"/>
+              <w:left w:type="dxa" w:w="80"/>
+              <w:bottom w:type="dxa" w:w="80"/>
+              <w:right w:type="dxa" w:w="80"/>
+            </w:tcMar>
+          </w:tcPr>
+          <w:p>
+            <w:pPr>
+              <w:spacing w:after="40"/>
+              <w:jc w:val="left"/>
+            </w:pPr>
+            <w:r>
+              <w:rPr>
+                <w:b w:val="false"/>
+                <w:bCs w:val="false"/>
+                <w:i w:val="false"/>
+                <w:iCs w:val="false"/>
+                <w:color w:val="000000"/>
+                <w:sz w:val="20"/>
+                <w:szCs w:val="20"/>
+                <w:rFonts w:ascii="Times New Roman" w:cs="Times New Roman" w:eastAsia="Times New Roman" w:hAnsi="Times New Roman"/>
+              </w:rPr>
+              <w:t xml:space="preserve">Fait lire le document « La convention du patrimoine mondial » (d’après la Convention de l’UNESCO concernant la protection du patrimoine mondial, culturel et naturel (Paris, 1972) — extraits adaptés), puis pose les questions.</w:t>
+            </w:r>
+          </w:p>
+        </w:tc>
+        <w:tc>
+          <w:tcPr>
+            <w:tcMar>
+              <w:top w:type="dxa" w:w="80"/>
+              <w:left w:type="dxa" w:w="80"/>
+              <w:bottom w:type="dxa" w:w="80"/>
+              <w:right w:type="dxa" w:w="80"/>
+            </w:tcMar>
+          </w:tcPr>
+          <w:p>
+            <w:pPr>
+              <w:spacing w:after="40"/>
+              <w:jc w:val="left"/>
+            </w:pPr>
+            <w:r>
+              <w:rPr>
+                <w:b w:val="false"/>
+                <w:bCs w:val="false"/>
+                <w:i w:val="false"/>
+                <w:iCs w:val="false"/>
+                <w:color w:val="000000"/>
+                <w:sz w:val="20"/>
+                <w:szCs w:val="20"/>
+                <w:rFonts w:ascii="Times New Roman" w:cs="Times New Roman" w:eastAsia="Times New Roman" w:hAnsi="Times New Roman"/>
+              </w:rPr>
+              <w:t xml:space="preserve">Lisent le document, répondent aux questions et critiquent la source.</w:t>
+            </w:r>
+          </w:p>
+        </w:tc>
+        <w:tc>
+          <w:tcPr>
+            <w:tcMar>
+              <w:top w:type="dxa" w:w="80"/>
+              <w:left w:type="dxa" w:w="80"/>
+              <w:bottom w:type="dxa" w:w="80"/>
+              <w:right w:type="dxa" w:w="80"/>
+            </w:tcMar>
+          </w:tcPr>
+          <w:p>
+            <w:pPr>
+              <w:spacing w:after="40"/>
+              <w:jc w:val="left"/>
+            </w:pPr>
+            <w:r>
+              <w:rPr>
+                <w:b w:val="false"/>
+                <w:bCs w:val="false"/>
+                <w:i w:val="false"/>
+                <w:iCs w:val="false"/>
+                <w:color w:val="000000"/>
+                <w:sz w:val="20"/>
+                <w:szCs w:val="20"/>
+                <w:rFonts w:ascii="Times New Roman" w:cs="Times New Roman" w:eastAsia="Times New Roman" w:hAnsi="Times New Roman"/>
+              </w:rPr>
+              <w:t xml:space="preserve">Observation dirigée, travail en binômes</w:t>
+            </w:r>
+          </w:p>
+        </w:tc>
+        <w:tc>
+          <w:tcPr>
+            <w:tcMar>
+              <w:top w:type="dxa" w:w="80"/>
+              <w:left w:type="dxa" w:w="80"/>
+              <w:bottom w:type="dxa" w:w="80"/>
+              <w:right w:type="dxa" w:w="80"/>
+            </w:tcMar>
+          </w:tcPr>
+          <w:p>
+            <w:pPr>
+              <w:spacing w:after="40"/>
+              <w:jc w:val="left"/>
+            </w:pPr>
+            <w:r>
+              <w:rPr>
+                <w:b w:val="false"/>
+                <w:bCs w:val="false"/>
+                <w:i w:val="false"/>
+                <w:iCs w:val="false"/>
+                <w:color w:val="000000"/>
+                <w:sz w:val="20"/>
+                <w:szCs w:val="20"/>
+                <w:rFonts w:ascii="Times New Roman" w:cs="Times New Roman" w:eastAsia="Times New Roman" w:hAnsi="Times New Roman"/>
+              </w:rPr>
+              <w:t xml:space="preserve">Document imprimé</w:t>
+            </w:r>
+          </w:p>
+        </w:tc>
+        <w:tc>
+          <w:tcPr>
+            <w:tcMar>
+              <w:top w:type="dxa" w:w="80"/>
+              <w:left w:type="dxa" w:w="80"/>
+              <w:bottom w:type="dxa" w:w="80"/>
+              <w:right w:type="dxa" w:w="80"/>
+            </w:tcMar>
+          </w:tcPr>
+          <w:p>
+            <w:pPr>
+              <w:spacing w:after="40"/>
+              <w:jc w:val="left"/>
+            </w:pPr>
+            <w:r>
+              <w:rPr>
+                <w:b w:val="false"/>
+                <w:bCs w:val="false"/>
+                <w:i w:val="false"/>
+                <w:iCs w:val="false"/>
+                <w:color w:val="000000"/>
+                <w:sz w:val="20"/>
+                <w:szCs w:val="20"/>
+                <w:rFonts w:ascii="Times New Roman" w:cs="Times New Roman" w:eastAsia="Times New Roman" w:hAnsi="Times New Roman"/>
+              </w:rPr>
+              <w:t xml:space="preserve">Esprit critique</w:t>
             </w:r>
           </w:p>
         </w:tc>
@@ -2746,7 +2746,26 @@
     </w:p>
     <w:p>
       <w:pPr>
-        <w:spacing w:after="110" w:line="300"/>
+        <w:spacing w:after="160" w:line="300"/>
+        <w:jc w:val="center"/>
+      </w:pPr>
+      <w:r>
+        <w:rPr>
+          <w:b w:val="false"/>
+          <w:bCs w:val="false"/>
+          <w:i/>
+          <w:iCs/>
+          <w:color w:val="000000"/>
+          <w:sz w:val="21"/>
+          <w:szCs w:val="21"/>
+          <w:rFonts w:ascii="Times New Roman" w:cs="Times New Roman" w:eastAsia="Times New Roman" w:hAnsi="Times New Roman"/>
+        </w:rPr>
+        <w:t xml:space="preserve">Un palais se visite, un conte s’écoute : deux formes d’un même trésor hérité.</w:t>
+      </w:r>
+    </w:p>
+    <w:p>
+      <w:pPr>
+        <w:spacing w:after="80" w:line="300"/>
         <w:jc w:val="both"/>
       </w:pPr>
       <w:r>
@@ -2756,31 +2775,69 @@
           <w:i w:val="false"/>
           <w:iCs w:val="false"/>
           <w:color w:val="2E7D32"/>
-          <w:sz w:val="24"/>
-          <w:szCs w:val="24"/>
-          <w:rFonts w:ascii="Times New Roman" w:cs="Times New Roman" w:eastAsia="Times New Roman" w:hAnsi="Times New Roman"/>
-        </w:rPr>
-        <w:t xml:space="preserve">Définition — </w:t>
-      </w:r>
+          <w:sz w:val="26"/>
+          <w:szCs w:val="26"/>
+          <w:rFonts w:ascii="Times New Roman" w:cs="Times New Roman" w:eastAsia="Times New Roman" w:hAnsi="Times New Roman"/>
+        </w:rPr>
+        <w:t xml:space="preserve">1. Qu’est-ce que le patrimoine ?</w:t>
+      </w:r>
+    </w:p>
+    <w:p>
+      <w:pPr>
+        <w:spacing w:after="100" w:line="300"/>
+        <w:jc w:val="both"/>
+      </w:pPr>
+      <w:r>
+        <w:rPr>
+          <w:b w:val="false"/>
+          <w:bCs w:val="false"/>
+          <w:i w:val="false"/>
+          <w:iCs w:val="false"/>
+          <w:color w:val="000000"/>
+          <w:sz w:val="24"/>
+          <w:szCs w:val="24"/>
+          <w:rFonts w:ascii="Times New Roman" w:cs="Times New Roman" w:eastAsia="Times New Roman" w:hAnsi="Times New Roman"/>
+        </w:rPr>
+        <w:t xml:space="preserve">Le mot patrimoine vient du latin patrimonium : « ce qui vient des pères » — l’héritage. Appliqué à la culture, il désigne tout ce qu’une communauté — village, région, nation, humanité — reçoit du passé, reconnaît comme précieux et décide de transmettre.</w:t>
+      </w:r>
+    </w:p>
+    <w:p>
+      <w:pPr>
+        <w:spacing w:after="80" w:line="300"/>
+        <w:jc w:val="both"/>
+      </w:pPr>
       <w:r>
         <w:rPr>
           <w:b/>
           <w:bCs/>
           <w:i w:val="false"/>
           <w:iCs w:val="false"/>
+          <w:color w:val="2E7D32"/>
+          <w:sz w:val="26"/>
+          <w:szCs w:val="26"/>
+          <w:rFonts w:ascii="Times New Roman" w:cs="Times New Roman" w:eastAsia="Times New Roman" w:hAnsi="Times New Roman"/>
+        </w:rPr>
+        <w:t xml:space="preserve">2. Le patrimoine matériel : ce qui se touche</w:t>
+      </w:r>
+    </w:p>
+    <w:p>
+      <w:pPr>
+        <w:spacing w:after="100" w:line="300"/>
+        <w:jc w:val="both"/>
+      </w:pPr>
+      <w:r>
+        <w:rPr>
+          <w:b w:val="false"/>
+          <w:bCs w:val="false"/>
+          <w:i w:val="false"/>
+          <w:iCs w:val="false"/>
           <w:color w:val="000000"/>
           <w:sz w:val="24"/>
           <w:szCs w:val="24"/>
           <w:rFonts w:ascii="Times New Roman" w:cs="Times New Roman" w:eastAsia="Times New Roman" w:hAnsi="Times New Roman"/>
         </w:rPr>
-        <w:t xml:space="preserve">Le patrimoine culturel est l’ensemble des biens hérités du passé qu’une communauté reconnaît comme siens et veut transmettre. Il est matériel quand il se compose de biens concrets : monuments, sites archéologiques, paysages construits, œuvres d’art, documents. Il est immatériel quand il se compose de pratiques vivantes : traditions orales, arts du spectacle, rituels et pratiques sociales, fêtes.</w:t>
-      </w:r>
-    </w:p>
-    <w:p>
-      <w:pPr>
-        <w:spacing w:after="110" w:line="300"/>
-        <w:jc w:val="both"/>
-      </w:pPr>
+        <w:t xml:space="preserve">Le patrimoine </w:t>
+      </w:r>
       <w:r>
         <w:rPr>
           <w:b/>
@@ -2792,7 +2849,7 @@
           <w:szCs w:val="24"/>
           <w:rFonts w:ascii="Times New Roman" w:cs="Times New Roman" w:eastAsia="Times New Roman" w:hAnsi="Times New Roman"/>
         </w:rPr>
-        <w:t xml:space="preserve">Autrement dit : </w:t>
+        <w:t xml:space="preserve">matériel</w:t>
       </w:r>
       <w:r>
         <w:rPr>
@@ -2805,12 +2862,12 @@
           <w:szCs w:val="24"/>
           <w:rFonts w:ascii="Times New Roman" w:cs="Times New Roman" w:eastAsia="Times New Roman" w:hAnsi="Times New Roman"/>
         </w:rPr>
-        <w:t xml:space="preserve">le patrimoine matériel se touche et se visite (palais, sites, objets, manuscrits) ; le patrimoine immatériel se vit et se pratique (contes, chants, danses, rites, fêtes).</w:t>
-      </w:r>
-    </w:p>
-    <w:p>
-      <w:pPr>
-        <w:spacing w:after="110" w:line="300"/>
+        <w:t xml:space="preserve"> de Madagascar est d’une grande richesse :</w:t>
+      </w:r>
+    </w:p>
+    <w:p>
+      <w:pPr>
+        <w:spacing w:after="60" w:line="300"/>
         <w:jc w:val="both"/>
       </w:pPr>
       <w:r>
@@ -2824,7 +2881,625 @@
           <w:szCs w:val="24"/>
           <w:rFonts w:ascii="Times New Roman" w:cs="Times New Roman" w:eastAsia="Times New Roman" w:hAnsi="Times New Roman"/>
         </w:rPr>
-        <w:t xml:space="preserve">Le mot patrimoine vient du latin patrimonium : « ce qui vient des pères » — l’héritage. Appliqué à la culture, il désigne tout ce qu’une communauté — village, région, nation, humanité — reçoit du passé, reconnaît comme précieux et décide de transmettre. Le patrimoine matériel de Madagascar est d’une grande richesse : des monuments comme le Rova d’Antananarivo ou les portes de pierre des villages fortifiés de l’Imerina ; des sites archéologiques, tels les anciens villages des Hautes Terres ou les comptoirs échangeurs de la côte ; des paysages construits — les rizières en terrasses betsileo, œuvre de générations ; des œuvres d’art, comme les aloalo funéraires mahafaly ; des documents, enfin : les sorabe en caractères arabes, les archives royales, les photographies anciennes. Le patrimoine immatériel est tout aussi précieux, mais fragile autrement : il ne vit que tant qu’on le pratique. Les traditions orales — contes (angano), proverbes (ohabolana), généalogies récitées ; les arts du spectacle — le hiragasy des Hautes Terres, les chants et musiques de chaque région ; les rituels et pratiques sociales — le famadihana, les cérémonies de circoncision, les kabary de mariage ; les fêtes — le fandroana d’autrefois, les fêtes de villages. L’UNESCO protège ces deux formes au niveau mondial : la colline royale d’Ambohimanga est classée patrimoine mondial (matériel), et le savoir-faire du bois des Zafimaniry comme le kabary malgache sont inscrits au patrimoine immatériel de l’humanité. Première mission du citoyen : connaître ce double trésor — on ne protège bien que ce qu’on connaît.</w:t>
+        <w:t xml:space="preserve">• des </w:t>
+      </w:r>
+      <w:r>
+        <w:rPr>
+          <w:b/>
+          <w:bCs/>
+          <w:i w:val="false"/>
+          <w:iCs w:val="false"/>
+          <w:color w:val="1F4E79"/>
+          <w:sz w:val="24"/>
+          <w:szCs w:val="24"/>
+          <w:rFonts w:ascii="Times New Roman" w:cs="Times New Roman" w:eastAsia="Times New Roman" w:hAnsi="Times New Roman"/>
+        </w:rPr>
+        <w:t xml:space="preserve">monuments</w:t>
+      </w:r>
+      <w:r>
+        <w:rPr>
+          <w:b w:val="false"/>
+          <w:bCs w:val="false"/>
+          <w:i w:val="false"/>
+          <w:iCs w:val="false"/>
+          <w:color w:val="000000"/>
+          <w:sz w:val="24"/>
+          <w:szCs w:val="24"/>
+          <w:rFonts w:ascii="Times New Roman" w:cs="Times New Roman" w:eastAsia="Times New Roman" w:hAnsi="Times New Roman"/>
+        </w:rPr>
+        <w:t xml:space="preserve">, comme le Rova d’Antananarivo ou les portes de pierre des villages fortifiés de l’Imerina ;</w:t>
+      </w:r>
+    </w:p>
+    <w:p>
+      <w:pPr>
+        <w:spacing w:after="60" w:line="300"/>
+        <w:jc w:val="both"/>
+      </w:pPr>
+      <w:r>
+        <w:rPr>
+          <w:b w:val="false"/>
+          <w:bCs w:val="false"/>
+          <w:i w:val="false"/>
+          <w:iCs w:val="false"/>
+          <w:color w:val="000000"/>
+          <w:sz w:val="24"/>
+          <w:szCs w:val="24"/>
+          <w:rFonts w:ascii="Times New Roman" w:cs="Times New Roman" w:eastAsia="Times New Roman" w:hAnsi="Times New Roman"/>
+        </w:rPr>
+        <w:t xml:space="preserve">• des </w:t>
+      </w:r>
+      <w:r>
+        <w:rPr>
+          <w:b/>
+          <w:bCs/>
+          <w:i w:val="false"/>
+          <w:iCs w:val="false"/>
+          <w:color w:val="1F4E79"/>
+          <w:sz w:val="24"/>
+          <w:szCs w:val="24"/>
+          <w:rFonts w:ascii="Times New Roman" w:cs="Times New Roman" w:eastAsia="Times New Roman" w:hAnsi="Times New Roman"/>
+        </w:rPr>
+        <w:t xml:space="preserve">sites archéologiques</w:t>
+      </w:r>
+      <w:r>
+        <w:rPr>
+          <w:b w:val="false"/>
+          <w:bCs w:val="false"/>
+          <w:i w:val="false"/>
+          <w:iCs w:val="false"/>
+          <w:color w:val="000000"/>
+          <w:sz w:val="24"/>
+          <w:szCs w:val="24"/>
+          <w:rFonts w:ascii="Times New Roman" w:cs="Times New Roman" w:eastAsia="Times New Roman" w:hAnsi="Times New Roman"/>
+        </w:rPr>
+        <w:t xml:space="preserve">, tels les anciens villages des Hautes Terres ou les comptoirs échangeurs de la côte ;</w:t>
+      </w:r>
+    </w:p>
+    <w:p>
+      <w:pPr>
+        <w:spacing w:after="60" w:line="300"/>
+        <w:jc w:val="both"/>
+      </w:pPr>
+      <w:r>
+        <w:rPr>
+          <w:b w:val="false"/>
+          <w:bCs w:val="false"/>
+          <w:i w:val="false"/>
+          <w:iCs w:val="false"/>
+          <w:color w:val="000000"/>
+          <w:sz w:val="24"/>
+          <w:szCs w:val="24"/>
+          <w:rFonts w:ascii="Times New Roman" w:cs="Times New Roman" w:eastAsia="Times New Roman" w:hAnsi="Times New Roman"/>
+        </w:rPr>
+        <w:t xml:space="preserve">• des </w:t>
+      </w:r>
+      <w:r>
+        <w:rPr>
+          <w:b/>
+          <w:bCs/>
+          <w:i w:val="false"/>
+          <w:iCs w:val="false"/>
+          <w:color w:val="1F4E79"/>
+          <w:sz w:val="24"/>
+          <w:szCs w:val="24"/>
+          <w:rFonts w:ascii="Times New Roman" w:cs="Times New Roman" w:eastAsia="Times New Roman" w:hAnsi="Times New Roman"/>
+        </w:rPr>
+        <w:t xml:space="preserve">paysages construits</w:t>
+      </w:r>
+      <w:r>
+        <w:rPr>
+          <w:b w:val="false"/>
+          <w:bCs w:val="false"/>
+          <w:i w:val="false"/>
+          <w:iCs w:val="false"/>
+          <w:color w:val="000000"/>
+          <w:sz w:val="24"/>
+          <w:szCs w:val="24"/>
+          <w:rFonts w:ascii="Times New Roman" w:cs="Times New Roman" w:eastAsia="Times New Roman" w:hAnsi="Times New Roman"/>
+        </w:rPr>
+        <w:t xml:space="preserve"> — les rizières en terrasses betsileo, œuvre de générations ;</w:t>
+      </w:r>
+    </w:p>
+    <w:p>
+      <w:pPr>
+        <w:spacing w:after="60" w:line="300"/>
+        <w:jc w:val="both"/>
+      </w:pPr>
+      <w:r>
+        <w:rPr>
+          <w:b w:val="false"/>
+          <w:bCs w:val="false"/>
+          <w:i w:val="false"/>
+          <w:iCs w:val="false"/>
+          <w:color w:val="000000"/>
+          <w:sz w:val="24"/>
+          <w:szCs w:val="24"/>
+          <w:rFonts w:ascii="Times New Roman" w:cs="Times New Roman" w:eastAsia="Times New Roman" w:hAnsi="Times New Roman"/>
+        </w:rPr>
+        <w:t xml:space="preserve">• des </w:t>
+      </w:r>
+      <w:r>
+        <w:rPr>
+          <w:b/>
+          <w:bCs/>
+          <w:i w:val="false"/>
+          <w:iCs w:val="false"/>
+          <w:color w:val="1F4E79"/>
+          <w:sz w:val="24"/>
+          <w:szCs w:val="24"/>
+          <w:rFonts w:ascii="Times New Roman" w:cs="Times New Roman" w:eastAsia="Times New Roman" w:hAnsi="Times New Roman"/>
+        </w:rPr>
+        <w:t xml:space="preserve">œuvres d’art</w:t>
+      </w:r>
+      <w:r>
+        <w:rPr>
+          <w:b w:val="false"/>
+          <w:bCs w:val="false"/>
+          <w:i w:val="false"/>
+          <w:iCs w:val="false"/>
+          <w:color w:val="000000"/>
+          <w:sz w:val="24"/>
+          <w:szCs w:val="24"/>
+          <w:rFonts w:ascii="Times New Roman" w:cs="Times New Roman" w:eastAsia="Times New Roman" w:hAnsi="Times New Roman"/>
+        </w:rPr>
+        <w:t xml:space="preserve">, comme les aloalo funéraires mahafaly ;</w:t>
+      </w:r>
+    </w:p>
+    <w:p>
+      <w:pPr>
+        <w:spacing w:after="60" w:line="300"/>
+        <w:jc w:val="both"/>
+      </w:pPr>
+      <w:r>
+        <w:rPr>
+          <w:b w:val="false"/>
+          <w:bCs w:val="false"/>
+          <w:i w:val="false"/>
+          <w:iCs w:val="false"/>
+          <w:color w:val="000000"/>
+          <w:sz w:val="24"/>
+          <w:szCs w:val="24"/>
+          <w:rFonts w:ascii="Times New Roman" w:cs="Times New Roman" w:eastAsia="Times New Roman" w:hAnsi="Times New Roman"/>
+        </w:rPr>
+        <w:t xml:space="preserve">• des </w:t>
+      </w:r>
+      <w:r>
+        <w:rPr>
+          <w:b/>
+          <w:bCs/>
+          <w:i w:val="false"/>
+          <w:iCs w:val="false"/>
+          <w:color w:val="1F4E79"/>
+          <w:sz w:val="24"/>
+          <w:szCs w:val="24"/>
+          <w:rFonts w:ascii="Times New Roman" w:cs="Times New Roman" w:eastAsia="Times New Roman" w:hAnsi="Times New Roman"/>
+        </w:rPr>
+        <w:t xml:space="preserve">documents</w:t>
+      </w:r>
+      <w:r>
+        <w:rPr>
+          <w:b w:val="false"/>
+          <w:bCs w:val="false"/>
+          <w:i w:val="false"/>
+          <w:iCs w:val="false"/>
+          <w:color w:val="000000"/>
+          <w:sz w:val="24"/>
+          <w:szCs w:val="24"/>
+          <w:rFonts w:ascii="Times New Roman" w:cs="Times New Roman" w:eastAsia="Times New Roman" w:hAnsi="Times New Roman"/>
+        </w:rPr>
+        <w:t xml:space="preserve"> : les sorabe en caractères arabes, les archives royales, les photographies anciennes.</w:t>
+      </w:r>
+    </w:p>
+    <w:p>
+      <w:pPr>
+        <w:spacing w:after="80" w:line="300"/>
+        <w:jc w:val="both"/>
+      </w:pPr>
+      <w:r>
+        <w:rPr>
+          <w:b/>
+          <w:bCs/>
+          <w:i w:val="false"/>
+          <w:iCs w:val="false"/>
+          <w:color w:val="2E7D32"/>
+          <w:sz w:val="26"/>
+          <w:szCs w:val="26"/>
+          <w:rFonts w:ascii="Times New Roman" w:cs="Times New Roman" w:eastAsia="Times New Roman" w:hAnsi="Times New Roman"/>
+        </w:rPr>
+        <w:t xml:space="preserve">3. Le patrimoine immatériel : ce qui se pratique</w:t>
+      </w:r>
+    </w:p>
+    <w:p>
+      <w:pPr>
+        <w:spacing w:after="100" w:line="300"/>
+        <w:jc w:val="both"/>
+      </w:pPr>
+      <w:r>
+        <w:rPr>
+          <w:b w:val="false"/>
+          <w:bCs w:val="false"/>
+          <w:i w:val="false"/>
+          <w:iCs w:val="false"/>
+          <w:color w:val="000000"/>
+          <w:sz w:val="24"/>
+          <w:szCs w:val="24"/>
+          <w:rFonts w:ascii="Times New Roman" w:cs="Times New Roman" w:eastAsia="Times New Roman" w:hAnsi="Times New Roman"/>
+        </w:rPr>
+        <w:t xml:space="preserve">Le patrimoine </w:t>
+      </w:r>
+      <w:r>
+        <w:rPr>
+          <w:b/>
+          <w:bCs/>
+          <w:i w:val="false"/>
+          <w:iCs w:val="false"/>
+          <w:color w:val="1F4E79"/>
+          <w:sz w:val="24"/>
+          <w:szCs w:val="24"/>
+          <w:rFonts w:ascii="Times New Roman" w:cs="Times New Roman" w:eastAsia="Times New Roman" w:hAnsi="Times New Roman"/>
+        </w:rPr>
+        <w:t xml:space="preserve">immatériel</w:t>
+      </w:r>
+      <w:r>
+        <w:rPr>
+          <w:b w:val="false"/>
+          <w:bCs w:val="false"/>
+          <w:i w:val="false"/>
+          <w:iCs w:val="false"/>
+          <w:color w:val="000000"/>
+          <w:sz w:val="24"/>
+          <w:szCs w:val="24"/>
+          <w:rFonts w:ascii="Times New Roman" w:cs="Times New Roman" w:eastAsia="Times New Roman" w:hAnsi="Times New Roman"/>
+        </w:rPr>
+        <w:t xml:space="preserve"> est tout aussi précieux, mais fragile autrement : il ne vit que tant qu’on le pratique :</w:t>
+      </w:r>
+    </w:p>
+    <w:p>
+      <w:pPr>
+        <w:spacing w:after="60" w:line="300"/>
+        <w:jc w:val="both"/>
+      </w:pPr>
+      <w:r>
+        <w:rPr>
+          <w:b w:val="false"/>
+          <w:bCs w:val="false"/>
+          <w:i w:val="false"/>
+          <w:iCs w:val="false"/>
+          <w:color w:val="000000"/>
+          <w:sz w:val="24"/>
+          <w:szCs w:val="24"/>
+          <w:rFonts w:ascii="Times New Roman" w:cs="Times New Roman" w:eastAsia="Times New Roman" w:hAnsi="Times New Roman"/>
+        </w:rPr>
+        <w:t xml:space="preserve">• les </w:t>
+      </w:r>
+      <w:r>
+        <w:rPr>
+          <w:b/>
+          <w:bCs/>
+          <w:i w:val="false"/>
+          <w:iCs w:val="false"/>
+          <w:color w:val="1F4E79"/>
+          <w:sz w:val="24"/>
+          <w:szCs w:val="24"/>
+          <w:rFonts w:ascii="Times New Roman" w:cs="Times New Roman" w:eastAsia="Times New Roman" w:hAnsi="Times New Roman"/>
+        </w:rPr>
+        <w:t xml:space="preserve">traditions orales</w:t>
+      </w:r>
+      <w:r>
+        <w:rPr>
+          <w:b w:val="false"/>
+          <w:bCs w:val="false"/>
+          <w:i w:val="false"/>
+          <w:iCs w:val="false"/>
+          <w:color w:val="000000"/>
+          <w:sz w:val="24"/>
+          <w:szCs w:val="24"/>
+          <w:rFonts w:ascii="Times New Roman" w:cs="Times New Roman" w:eastAsia="Times New Roman" w:hAnsi="Times New Roman"/>
+        </w:rPr>
+        <w:t xml:space="preserve"> — contes (angano), proverbes (ohabolana), généalogies récitées ;</w:t>
+      </w:r>
+    </w:p>
+    <w:p>
+      <w:pPr>
+        <w:spacing w:after="60" w:line="300"/>
+        <w:jc w:val="both"/>
+      </w:pPr>
+      <w:r>
+        <w:rPr>
+          <w:b w:val="false"/>
+          <w:bCs w:val="false"/>
+          <w:i w:val="false"/>
+          <w:iCs w:val="false"/>
+          <w:color w:val="000000"/>
+          <w:sz w:val="24"/>
+          <w:szCs w:val="24"/>
+          <w:rFonts w:ascii="Times New Roman" w:cs="Times New Roman" w:eastAsia="Times New Roman" w:hAnsi="Times New Roman"/>
+        </w:rPr>
+        <w:t xml:space="preserve">• les </w:t>
+      </w:r>
+      <w:r>
+        <w:rPr>
+          <w:b/>
+          <w:bCs/>
+          <w:i w:val="false"/>
+          <w:iCs w:val="false"/>
+          <w:color w:val="1F4E79"/>
+          <w:sz w:val="24"/>
+          <w:szCs w:val="24"/>
+          <w:rFonts w:ascii="Times New Roman" w:cs="Times New Roman" w:eastAsia="Times New Roman" w:hAnsi="Times New Roman"/>
+        </w:rPr>
+        <w:t xml:space="preserve">arts du spectacle</w:t>
+      </w:r>
+      <w:r>
+        <w:rPr>
+          <w:b w:val="false"/>
+          <w:bCs w:val="false"/>
+          <w:i w:val="false"/>
+          <w:iCs w:val="false"/>
+          <w:color w:val="000000"/>
+          <w:sz w:val="24"/>
+          <w:szCs w:val="24"/>
+          <w:rFonts w:ascii="Times New Roman" w:cs="Times New Roman" w:eastAsia="Times New Roman" w:hAnsi="Times New Roman"/>
+        </w:rPr>
+        <w:t xml:space="preserve"> — le hiragasy des Hautes Terres, les chants et musiques de chaque région ;</w:t>
+      </w:r>
+    </w:p>
+    <w:p>
+      <w:pPr>
+        <w:spacing w:after="60" w:line="300"/>
+        <w:jc w:val="both"/>
+      </w:pPr>
+      <w:r>
+        <w:rPr>
+          <w:b w:val="false"/>
+          <w:bCs w:val="false"/>
+          <w:i w:val="false"/>
+          <w:iCs w:val="false"/>
+          <w:color w:val="000000"/>
+          <w:sz w:val="24"/>
+          <w:szCs w:val="24"/>
+          <w:rFonts w:ascii="Times New Roman" w:cs="Times New Roman" w:eastAsia="Times New Roman" w:hAnsi="Times New Roman"/>
+        </w:rPr>
+        <w:t xml:space="preserve">• les </w:t>
+      </w:r>
+      <w:r>
+        <w:rPr>
+          <w:b/>
+          <w:bCs/>
+          <w:i w:val="false"/>
+          <w:iCs w:val="false"/>
+          <w:color w:val="1F4E79"/>
+          <w:sz w:val="24"/>
+          <w:szCs w:val="24"/>
+          <w:rFonts w:ascii="Times New Roman" w:cs="Times New Roman" w:eastAsia="Times New Roman" w:hAnsi="Times New Roman"/>
+        </w:rPr>
+        <w:t xml:space="preserve">rituels</w:t>
+      </w:r>
+      <w:r>
+        <w:rPr>
+          <w:b w:val="false"/>
+          <w:bCs w:val="false"/>
+          <w:i w:val="false"/>
+          <w:iCs w:val="false"/>
+          <w:color w:val="000000"/>
+          <w:sz w:val="24"/>
+          <w:szCs w:val="24"/>
+          <w:rFonts w:ascii="Times New Roman" w:cs="Times New Roman" w:eastAsia="Times New Roman" w:hAnsi="Times New Roman"/>
+        </w:rPr>
+        <w:t xml:space="preserve"> et pratiques sociales — le famadihana, les cérémonies de circoncision, les kabary de mariage ;</w:t>
+      </w:r>
+    </w:p>
+    <w:p>
+      <w:pPr>
+        <w:spacing w:after="60" w:line="300"/>
+        <w:jc w:val="both"/>
+      </w:pPr>
+      <w:r>
+        <w:rPr>
+          <w:b w:val="false"/>
+          <w:bCs w:val="false"/>
+          <w:i w:val="false"/>
+          <w:iCs w:val="false"/>
+          <w:color w:val="000000"/>
+          <w:sz w:val="24"/>
+          <w:szCs w:val="24"/>
+          <w:rFonts w:ascii="Times New Roman" w:cs="Times New Roman" w:eastAsia="Times New Roman" w:hAnsi="Times New Roman"/>
+        </w:rPr>
+        <w:t xml:space="preserve">• les </w:t>
+      </w:r>
+      <w:r>
+        <w:rPr>
+          <w:b/>
+          <w:bCs/>
+          <w:i w:val="false"/>
+          <w:iCs w:val="false"/>
+          <w:color w:val="1F4E79"/>
+          <w:sz w:val="24"/>
+          <w:szCs w:val="24"/>
+          <w:rFonts w:ascii="Times New Roman" w:cs="Times New Roman" w:eastAsia="Times New Roman" w:hAnsi="Times New Roman"/>
+        </w:rPr>
+        <w:t xml:space="preserve">fêtes</w:t>
+      </w:r>
+      <w:r>
+        <w:rPr>
+          <w:b w:val="false"/>
+          <w:bCs w:val="false"/>
+          <w:i w:val="false"/>
+          <w:iCs w:val="false"/>
+          <w:color w:val="000000"/>
+          <w:sz w:val="24"/>
+          <w:szCs w:val="24"/>
+          <w:rFonts w:ascii="Times New Roman" w:cs="Times New Roman" w:eastAsia="Times New Roman" w:hAnsi="Times New Roman"/>
+        </w:rPr>
+        <w:t xml:space="preserve"> — le fandroana d’autrefois, les </w:t>
+      </w:r>
+      <w:r>
+        <w:rPr>
+          <w:b/>
+          <w:bCs/>
+          <w:i w:val="false"/>
+          <w:iCs w:val="false"/>
+          <w:color w:val="1F4E79"/>
+          <w:sz w:val="24"/>
+          <w:szCs w:val="24"/>
+          <w:rFonts w:ascii="Times New Roman" w:cs="Times New Roman" w:eastAsia="Times New Roman" w:hAnsi="Times New Roman"/>
+        </w:rPr>
+        <w:t xml:space="preserve">fêtes</w:t>
+      </w:r>
+      <w:r>
+        <w:rPr>
+          <w:b w:val="false"/>
+          <w:bCs w:val="false"/>
+          <w:i w:val="false"/>
+          <w:iCs w:val="false"/>
+          <w:color w:val="000000"/>
+          <w:sz w:val="24"/>
+          <w:szCs w:val="24"/>
+          <w:rFonts w:ascii="Times New Roman" w:cs="Times New Roman" w:eastAsia="Times New Roman" w:hAnsi="Times New Roman"/>
+        </w:rPr>
+        <w:t xml:space="preserve"> de villages.</w:t>
+      </w:r>
+    </w:p>
+    <w:p>
+      <w:pPr>
+        <w:spacing w:after="80" w:line="300"/>
+        <w:jc w:val="both"/>
+      </w:pPr>
+      <w:r>
+        <w:rPr>
+          <w:b/>
+          <w:bCs/>
+          <w:i w:val="false"/>
+          <w:iCs w:val="false"/>
+          <w:color w:val="2E7D32"/>
+          <w:sz w:val="26"/>
+          <w:szCs w:val="26"/>
+          <w:rFonts w:ascii="Times New Roman" w:cs="Times New Roman" w:eastAsia="Times New Roman" w:hAnsi="Times New Roman"/>
+        </w:rPr>
+        <w:t xml:space="preserve">4. Une reconnaissance mondiale</w:t>
+      </w:r>
+    </w:p>
+    <w:p>
+      <w:pPr>
+        <w:spacing w:after="100" w:line="300"/>
+        <w:jc w:val="both"/>
+      </w:pPr>
+      <w:r>
+        <w:rPr>
+          <w:b w:val="false"/>
+          <w:bCs w:val="false"/>
+          <w:i w:val="false"/>
+          <w:iCs w:val="false"/>
+          <w:color w:val="000000"/>
+          <w:sz w:val="24"/>
+          <w:szCs w:val="24"/>
+          <w:rFonts w:ascii="Times New Roman" w:cs="Times New Roman" w:eastAsia="Times New Roman" w:hAnsi="Times New Roman"/>
+        </w:rPr>
+        <w:t xml:space="preserve">L’</w:t>
+      </w:r>
+      <w:r>
+        <w:rPr>
+          <w:b/>
+          <w:bCs/>
+          <w:i w:val="false"/>
+          <w:iCs w:val="false"/>
+          <w:color w:val="1F4E79"/>
+          <w:sz w:val="24"/>
+          <w:szCs w:val="24"/>
+          <w:rFonts w:ascii="Times New Roman" w:cs="Times New Roman" w:eastAsia="Times New Roman" w:hAnsi="Times New Roman"/>
+        </w:rPr>
+        <w:t xml:space="preserve">UNESCO</w:t>
+      </w:r>
+      <w:r>
+        <w:rPr>
+          <w:b w:val="false"/>
+          <w:bCs w:val="false"/>
+          <w:i w:val="false"/>
+          <w:iCs w:val="false"/>
+          <w:color w:val="000000"/>
+          <w:sz w:val="24"/>
+          <w:szCs w:val="24"/>
+          <w:rFonts w:ascii="Times New Roman" w:cs="Times New Roman" w:eastAsia="Times New Roman" w:hAnsi="Times New Roman"/>
+        </w:rPr>
+        <w:t xml:space="preserve"> protège ces deux formes au niveau mondial : la colline royale d’</w:t>
+      </w:r>
+      <w:r>
+        <w:rPr>
+          <w:b/>
+          <w:bCs/>
+          <w:i w:val="false"/>
+          <w:iCs w:val="false"/>
+          <w:color w:val="1F4E79"/>
+          <w:sz w:val="24"/>
+          <w:szCs w:val="24"/>
+          <w:rFonts w:ascii="Times New Roman" w:cs="Times New Roman" w:eastAsia="Times New Roman" w:hAnsi="Times New Roman"/>
+        </w:rPr>
+        <w:t xml:space="preserve">Ambohimanga</w:t>
+      </w:r>
+      <w:r>
+        <w:rPr>
+          <w:b w:val="false"/>
+          <w:bCs w:val="false"/>
+          <w:i w:val="false"/>
+          <w:iCs w:val="false"/>
+          <w:color w:val="000000"/>
+          <w:sz w:val="24"/>
+          <w:szCs w:val="24"/>
+          <w:rFonts w:ascii="Times New Roman" w:cs="Times New Roman" w:eastAsia="Times New Roman" w:hAnsi="Times New Roman"/>
+        </w:rPr>
+        <w:t xml:space="preserve"> est classée patrimoine mondial (</w:t>
+      </w:r>
+      <w:r>
+        <w:rPr>
+          <w:b/>
+          <w:bCs/>
+          <w:i w:val="false"/>
+          <w:iCs w:val="false"/>
+          <w:color w:val="1F4E79"/>
+          <w:sz w:val="24"/>
+          <w:szCs w:val="24"/>
+          <w:rFonts w:ascii="Times New Roman" w:cs="Times New Roman" w:eastAsia="Times New Roman" w:hAnsi="Times New Roman"/>
+        </w:rPr>
+        <w:t xml:space="preserve">matériel</w:t>
+      </w:r>
+      <w:r>
+        <w:rPr>
+          <w:b w:val="false"/>
+          <w:bCs w:val="false"/>
+          <w:i w:val="false"/>
+          <w:iCs w:val="false"/>
+          <w:color w:val="000000"/>
+          <w:sz w:val="24"/>
+          <w:szCs w:val="24"/>
+          <w:rFonts w:ascii="Times New Roman" w:cs="Times New Roman" w:eastAsia="Times New Roman" w:hAnsi="Times New Roman"/>
+        </w:rPr>
+        <w:t xml:space="preserve">), et le savoir-faire du bois des Zafimaniry comme le kabary malgache sont inscrits au patrimoine </w:t>
+      </w:r>
+      <w:r>
+        <w:rPr>
+          <w:b/>
+          <w:bCs/>
+          <w:i w:val="false"/>
+          <w:iCs w:val="false"/>
+          <w:color w:val="1F4E79"/>
+          <w:sz w:val="24"/>
+          <w:szCs w:val="24"/>
+          <w:rFonts w:ascii="Times New Roman" w:cs="Times New Roman" w:eastAsia="Times New Roman" w:hAnsi="Times New Roman"/>
+        </w:rPr>
+        <w:t xml:space="preserve">immatériel</w:t>
+      </w:r>
+      <w:r>
+        <w:rPr>
+          <w:b w:val="false"/>
+          <w:bCs w:val="false"/>
+          <w:i w:val="false"/>
+          <w:iCs w:val="false"/>
+          <w:color w:val="000000"/>
+          <w:sz w:val="24"/>
+          <w:szCs w:val="24"/>
+          <w:rFonts w:ascii="Times New Roman" w:cs="Times New Roman" w:eastAsia="Times New Roman" w:hAnsi="Times New Roman"/>
+        </w:rPr>
+        <w:t xml:space="preserve"> de l’humanité. Première mission du citoyen : connaître ce double trésor — on ne protège bien que ce qu’on connaît.</w:t>
       </w:r>
     </w:p>
     <w:p>
@@ -2875,8 +3550,331 @@
     </w:p>
     <w:p>
       <w:pPr>
-        <w:spacing w:before="200" w:after="150"/>
-        <w:jc w:val="left"/>
+        <w:spacing w:after="120"/>
+      </w:pPr>
+    </w:p>
+    <w:tbl>
+      <w:tblPr>
+        <w:tblW w:type="dxa" w:w="9600"/>
+        <w:tblBorders>
+          <w:top w:val="single" w:color="B25000" w:sz="12"/>
+          <w:left w:val="single" w:color="B25000" w:sz="12"/>
+          <w:bottom w:val="single" w:color="B25000" w:sz="12"/>
+          <w:right w:val="single" w:color="B25000" w:sz="12"/>
+          <w:insideH w:val="none"/>
+          <w:insideV w:val="none"/>
+        </w:tblBorders>
+        <w:tblLayout w:type="fixed"/>
+      </w:tblPr>
+      <w:tblGrid>
+        <w:gridCol w:w="9600"/>
+      </w:tblGrid>
+      <w:tr>
+        <w:tc>
+          <w:tcPr>
+            <w:shd w:fill="FFF8EF" w:val="clear"/>
+            <w:tcMar>
+              <w:top w:type="dxa" w:w="140"/>
+              <w:left w:type="dxa" w:w="180"/>
+              <w:bottom w:type="dxa" w:w="140"/>
+              <w:right w:type="dxa" w:w="180"/>
+            </w:tcMar>
+          </w:tcPr>
+          <w:p>
+            <w:pPr>
+              <w:spacing w:after="90"/>
+            </w:pPr>
+            <w:r>
+              <w:rPr>
+                <w:b/>
+                <w:bCs/>
+                <w:i w:val="false"/>
+                <w:iCs w:val="false"/>
+                <w:color w:val="B25000"/>
+                <w:sz w:val="25"/>
+                <w:szCs w:val="25"/>
+                <w:rFonts w:ascii="Times New Roman" w:cs="Times New Roman" w:eastAsia="Times New Roman" w:hAnsi="Times New Roman"/>
+              </w:rPr>
+              <w:t xml:space="preserve">Document à étudier</w:t>
+            </w:r>
+          </w:p>
+          <w:p>
+            <w:pPr>
+              <w:spacing w:after="80" w:line="300"/>
+              <w:jc w:val="left"/>
+            </w:pPr>
+            <w:r>
+              <w:rPr>
+                <w:b/>
+                <w:bCs/>
+                <w:i w:val="false"/>
+                <w:iCs w:val="false"/>
+                <w:color w:val="000000"/>
+                <w:sz w:val="21"/>
+                <w:szCs w:val="21"/>
+                <w:rFonts w:ascii="Times New Roman" w:cs="Times New Roman" w:eastAsia="Times New Roman" w:hAnsi="Times New Roman"/>
+              </w:rPr>
+              <w:t xml:space="preserve">La convention du patrimoine mondial — d’après la Convention de l’UNESCO concernant la protection du patrimoine mondial, culturel et naturel (Paris, 1972) — extraits adaptés</w:t>
+            </w:r>
+          </w:p>
+          <w:p>
+            <w:pPr>
+              <w:spacing w:after="100" w:line="300"/>
+              <w:jc w:val="both"/>
+            </w:pPr>
+            <w:r>
+              <w:rPr>
+                <w:b w:val="false"/>
+                <w:bCs w:val="false"/>
+                <w:i/>
+                <w:iCs/>
+                <w:color w:val="000000"/>
+                <w:sz w:val="24"/>
+                <w:szCs w:val="24"/>
+                <w:rFonts w:ascii="Times New Roman" w:cs="Times New Roman" w:eastAsia="Times New Roman" w:hAnsi="Times New Roman"/>
+              </w:rPr>
+              <w:t xml:space="preserve">« Constatant que le patrimoine culturel est de plus en plus menacé de destruction, et que la disparition d’un bien du patrimoine constitue un appauvrissement du patrimoine de tous les peuples du monde, les États signataires conviennent de ce qui suit. Sont considérés comme patrimoine culturel : les monuments, œuvres d’architecture, de sculpture ou de peinture ; les ensembles de constructions ; les sites, œuvres combinées de l’homme et de la nature, ayant une valeur universelle exceptionnelle. Chaque État s’engage à assurer l’identification, la protection, la conservation et la transmission aux générations futures du patrimoine situé sur son territoire. »</w:t>
+            </w:r>
+          </w:p>
+          <w:p>
+            <w:pPr>
+              <w:spacing w:after="40" w:line="300"/>
+              <w:jc w:val="both"/>
+            </w:pPr>
+            <w:r>
+              <w:rPr>
+                <w:b w:val="false"/>
+                <w:bCs w:val="false"/>
+                <w:i w:val="false"/>
+                <w:iCs w:val="false"/>
+                <w:color w:val="000000"/>
+                <w:sz w:val="24"/>
+                <w:szCs w:val="24"/>
+                <w:rFonts w:ascii="Times New Roman" w:cs="Times New Roman" w:eastAsia="Times New Roman" w:hAnsi="Times New Roman"/>
+              </w:rPr>
+              <w:t xml:space="preserve">1. Pourquoi la disparition d’un bien culturel appauvrit-elle « tous les peuples du monde » ?</w:t>
+            </w:r>
+          </w:p>
+          <w:p>
+            <w:pPr>
+              <w:spacing w:after="40" w:line="300"/>
+              <w:jc w:val="both"/>
+            </w:pPr>
+            <w:r>
+              <w:rPr>
+                <w:b w:val="false"/>
+                <w:bCs w:val="false"/>
+                <w:i w:val="false"/>
+                <w:iCs w:val="false"/>
+                <w:color w:val="000000"/>
+                <w:sz w:val="24"/>
+                <w:szCs w:val="24"/>
+                <w:rFonts w:ascii="Times New Roman" w:cs="Times New Roman" w:eastAsia="Times New Roman" w:hAnsi="Times New Roman"/>
+              </w:rPr>
+              <w:t xml:space="preserve">2. Relève les quatre devoirs que chaque État signataire accepte.</w:t>
+            </w:r>
+          </w:p>
+          <w:p>
+            <w:pPr>
+              <w:spacing w:after="40" w:line="300"/>
+              <w:jc w:val="both"/>
+            </w:pPr>
+            <w:r>
+              <w:rPr>
+                <w:b w:val="false"/>
+                <w:bCs w:val="false"/>
+                <w:i w:val="false"/>
+                <w:iCs w:val="false"/>
+                <w:color w:val="000000"/>
+                <w:sz w:val="24"/>
+                <w:szCs w:val="24"/>
+                <w:rFonts w:ascii="Times New Roman" w:cs="Times New Roman" w:eastAsia="Times New Roman" w:hAnsi="Times New Roman"/>
+              </w:rPr>
+              <w:t xml:space="preserve">3. À quelle catégorie de la convention rattaches-tu la colline d’Ambohimanga ? Justifie.</w:t>
+            </w:r>
+          </w:p>
+          <w:p>
+            <w:pPr>
+              <w:spacing w:after="60"/>
+            </w:pPr>
+          </w:p>
+          <w:p>
+            <w:pPr>
+              <w:spacing w:after="40"/>
+            </w:pPr>
+            <w:r>
+              <w:rPr>
+                <w:b/>
+                <w:bCs/>
+                <w:i w:val="false"/>
+                <w:iCs w:val="false"/>
+                <w:color w:val="C2185B"/>
+                <w:sz w:val="22"/>
+                <w:szCs w:val="22"/>
+                <w:rFonts w:ascii="Times New Roman" w:cs="Times New Roman" w:eastAsia="Times New Roman" w:hAnsi="Times New Roman"/>
+              </w:rPr>
+              <w:t xml:space="preserve">Réponse 1. </w:t>
+            </w:r>
+            <w:r>
+              <w:rPr>
+                <w:b w:val="false"/>
+                <w:bCs w:val="false"/>
+                <w:i w:val="false"/>
+                <w:iCs w:val="false"/>
+                <w:color w:val="000000"/>
+                <w:sz w:val="22"/>
+                <w:szCs w:val="22"/>
+                <w:rFonts w:ascii="Times New Roman" w:cs="Times New Roman" w:eastAsia="Times New Roman" w:hAnsi="Times New Roman"/>
+              </w:rPr>
+              <w:t xml:space="preserve">Parce qu’un bien exceptionnel a une valeur universelle : il appartient à l’histoire de l’humanité entière — sa perte est irréparable pour tous, pas seulement pour son pays.</w:t>
+            </w:r>
+          </w:p>
+          <w:p>
+            <w:pPr>
+              <w:spacing w:after="40"/>
+            </w:pPr>
+            <w:r>
+              <w:rPr>
+                <w:b/>
+                <w:bCs/>
+                <w:i w:val="false"/>
+                <w:iCs w:val="false"/>
+                <w:color w:val="C2185B"/>
+                <w:sz w:val="22"/>
+                <w:szCs w:val="22"/>
+                <w:rFonts w:ascii="Times New Roman" w:cs="Times New Roman" w:eastAsia="Times New Roman" w:hAnsi="Times New Roman"/>
+              </w:rPr>
+              <w:t xml:space="preserve">Réponse 2. </w:t>
+            </w:r>
+            <w:r>
+              <w:rPr>
+                <w:b w:val="false"/>
+                <w:bCs w:val="false"/>
+                <w:i w:val="false"/>
+                <w:iCs w:val="false"/>
+                <w:color w:val="000000"/>
+                <w:sz w:val="22"/>
+                <w:szCs w:val="22"/>
+                <w:rFonts w:ascii="Times New Roman" w:cs="Times New Roman" w:eastAsia="Times New Roman" w:hAnsi="Times New Roman"/>
+              </w:rPr>
+              <w:t xml:space="preserve">Identifier, protéger, conserver et transmettre aux générations futures le patrimoine de son territoire.</w:t>
+            </w:r>
+          </w:p>
+          <w:p>
+            <w:pPr>
+              <w:spacing w:after="40"/>
+            </w:pPr>
+            <w:r>
+              <w:rPr>
+                <w:b/>
+                <w:bCs/>
+                <w:i w:val="false"/>
+                <w:iCs w:val="false"/>
+                <w:color w:val="C2185B"/>
+                <w:sz w:val="22"/>
+                <w:szCs w:val="22"/>
+                <w:rFonts w:ascii="Times New Roman" w:cs="Times New Roman" w:eastAsia="Times New Roman" w:hAnsi="Times New Roman"/>
+              </w:rPr>
+              <w:t xml:space="preserve">Réponse 3. </w:t>
+            </w:r>
+            <w:r>
+              <w:rPr>
+                <w:b w:val="false"/>
+                <w:bCs w:val="false"/>
+                <w:i w:val="false"/>
+                <w:iCs w:val="false"/>
+                <w:color w:val="000000"/>
+                <w:sz w:val="22"/>
+                <w:szCs w:val="22"/>
+                <w:rFonts w:ascii="Times New Roman" w:cs="Times New Roman" w:eastAsia="Times New Roman" w:hAnsi="Times New Roman"/>
+              </w:rPr>
+              <w:t xml:space="preserve">Aux « sites, œuvres combinées de l’homme et de la nature » : la colline unit cité royale, porte de pierre et bois sacrés — c’est à ce titre qu’elle fut classée en 2001.</w:t>
+            </w:r>
+          </w:p>
+        </w:tc>
+      </w:tr>
+    </w:tbl>
+    <w:p>
+      <w:pPr>
+        <w:spacing w:after="160"/>
+      </w:pPr>
+    </w:p>
+    <w:tbl>
+      <w:tblPr>
+        <w:tblW w:type="dxa" w:w="9600"/>
+        <w:tblBorders>
+          <w:top w:val="single" w:color="1565C0" w:sz="12"/>
+          <w:left w:val="single" w:color="1565C0" w:sz="12"/>
+          <w:bottom w:val="single" w:color="1565C0" w:sz="12"/>
+          <w:right w:val="single" w:color="1565C0" w:sz="12"/>
+          <w:insideH w:val="none"/>
+          <w:insideV w:val="none"/>
+        </w:tblBorders>
+        <w:tblLayout w:type="fixed"/>
+      </w:tblPr>
+      <w:tblGrid>
+        <w:gridCol w:w="9600"/>
+      </w:tblGrid>
+      <w:tr>
+        <w:tc>
+          <w:tcPr>
+            <w:shd w:fill="E3F2FD" w:val="clear"/>
+            <w:tcMar>
+              <w:top w:type="dxa" w:w="140"/>
+              <w:left w:type="dxa" w:w="180"/>
+              <w:bottom w:type="dxa" w:w="140"/>
+              <w:right w:type="dxa" w:w="180"/>
+            </w:tcMar>
+          </w:tcPr>
+          <w:p>
+            <w:pPr>
+              <w:spacing w:after="90"/>
+            </w:pPr>
+            <w:r>
+              <w:rPr>
+                <w:b/>
+                <w:bCs/>
+                <w:i w:val="false"/>
+                <w:iCs w:val="false"/>
+                <w:color w:val="1565C0"/>
+                <w:sz w:val="25"/>
+                <w:szCs w:val="25"/>
+                <w:rFonts w:ascii="Times New Roman" w:cs="Times New Roman" w:eastAsia="Times New Roman" w:hAnsi="Times New Roman"/>
+              </w:rPr>
+              <w:t xml:space="preserve">Le savais-tu ?</w:t>
+            </w:r>
+          </w:p>
+          <w:p>
+            <w:pPr>
+              <w:spacing w:after="0" w:line="300"/>
+              <w:jc w:val="both"/>
+            </w:pPr>
+            <w:r>
+              <w:rPr>
+                <w:b w:val="false"/>
+                <w:bCs w:val="false"/>
+                <w:i w:val="false"/>
+                <w:iCs w:val="false"/>
+                <w:color w:val="000000"/>
+                <w:sz w:val="22"/>
+                <w:szCs w:val="22"/>
+                <w:rFonts w:ascii="Times New Roman" w:cs="Times New Roman" w:eastAsia="Times New Roman" w:hAnsi="Times New Roman"/>
+              </w:rPr>
+              <w:t xml:space="preserve">La colline royale d’Ambohimanga a été classée au patrimoine mondial de l’UNESCO en 2001 : ses bois sacrés, sa porte à disque de pierre — qu’une vingtaine d’hommes manœuvraient chaque soir ! — et sa cité royale en font un lieu unique. Et le kabary malgache, l’art oratoire des grandes occasions, est entré en 2021 au patrimoine immatériel de l’humanité : la parole malgache est désormais un trésor mondial.</w:t>
+            </w:r>
+          </w:p>
+        </w:tc>
+      </w:tr>
+    </w:tbl>
+    <w:p>
+      <w:pPr>
+        <w:spacing w:after="160"/>
+      </w:pPr>
+    </w:p>
+    <w:p>
+      <w:pPr>
+        <w:spacing w:after="80" w:line="300"/>
+        <w:jc w:val="both"/>
       </w:pPr>
       <w:r>
         <w:rPr>
@@ -2885,166 +3883,337 @@
           <w:i w:val="false"/>
           <w:iCs w:val="false"/>
           <w:color w:val="2E7D32"/>
-          <w:sz w:val="28"/>
-          <w:szCs w:val="28"/>
-          <w:rFonts w:ascii="Times New Roman" w:cs="Times New Roman" w:eastAsia="Times New Roman" w:hAnsi="Times New Roman"/>
-        </w:rPr>
-        <w:t xml:space="preserve">Méthode</w:t>
-      </w:r>
-    </w:p>
-    <w:p>
-      <w:pPr>
-        <w:spacing w:after="60" w:line="300"/>
-        <w:jc w:val="both"/>
-      </w:pPr>
-      <w:r>
-        <w:rPr>
-          <w:b w:val="false"/>
-          <w:bCs w:val="false"/>
-          <w:i w:val="false"/>
-          <w:iCs w:val="false"/>
-          <w:color w:val="000000"/>
-          <w:sz w:val="24"/>
-          <w:szCs w:val="24"/>
-          <w:rFonts w:ascii="Times New Roman" w:cs="Times New Roman" w:eastAsia="Times New Roman" w:hAnsi="Times New Roman"/>
-        </w:rPr>
-        <w:t xml:space="preserve">1. Définir le patrimoine par ses trois traits : hérité, reconnu, à transmettre.</w:t>
-      </w:r>
-    </w:p>
-    <w:p>
-      <w:pPr>
-        <w:spacing w:after="60" w:line="300"/>
-        <w:jc w:val="both"/>
-      </w:pPr>
-      <w:r>
-        <w:rPr>
-          <w:b w:val="false"/>
-          <w:bCs w:val="false"/>
-          <w:i w:val="false"/>
-          <w:iCs w:val="false"/>
-          <w:color w:val="000000"/>
-          <w:sz w:val="24"/>
-          <w:szCs w:val="24"/>
-          <w:rFonts w:ascii="Times New Roman" w:cs="Times New Roman" w:eastAsia="Times New Roman" w:hAnsi="Times New Roman"/>
-        </w:rPr>
-        <w:t xml:space="preserve">2. Classer tout exemple : matériel (se touche) ou immatériel (se pratique).</w:t>
-      </w:r>
-    </w:p>
-    <w:p>
-      <w:pPr>
-        <w:spacing w:after="60" w:line="300"/>
-        <w:jc w:val="both"/>
-      </w:pPr>
-      <w:r>
-        <w:rPr>
-          <w:b w:val="false"/>
-          <w:bCs w:val="false"/>
-          <w:i w:val="false"/>
-          <w:iCs w:val="false"/>
-          <w:color w:val="000000"/>
-          <w:sz w:val="24"/>
-          <w:szCs w:val="24"/>
-          <w:rFonts w:ascii="Times New Roman" w:cs="Times New Roman" w:eastAsia="Times New Roman" w:hAnsi="Times New Roman"/>
-        </w:rPr>
-        <w:t xml:space="preserve">3. Illustrer chaque catégorie par un exemple malgache précis.</w:t>
-      </w:r>
-    </w:p>
-    <w:p>
-      <w:pPr>
-        <w:spacing w:after="110" w:line="300"/>
-        <w:jc w:val="both"/>
-      </w:pPr>
-      <w:r>
-        <w:rPr>
-          <w:b/>
-          <w:bCs/>
-          <w:i w:val="false"/>
-          <w:iCs w:val="false"/>
-          <w:color w:val="1F4E79"/>
-          <w:sz w:val="24"/>
-          <w:szCs w:val="24"/>
-          <w:rFonts w:ascii="Times New Roman" w:cs="Times New Roman" w:eastAsia="Times New Roman" w:hAnsi="Times New Roman"/>
-        </w:rPr>
-        <w:t xml:space="preserve">Exemple — </w:t>
-      </w:r>
-      <w:r>
-        <w:rPr>
-          <w:b w:val="false"/>
-          <w:bCs w:val="false"/>
-          <w:i w:val="false"/>
-          <w:iCs w:val="false"/>
-          <w:color w:val="000000"/>
-          <w:sz w:val="24"/>
-          <w:szCs w:val="24"/>
-          <w:rFonts w:ascii="Times New Roman" w:cs="Times New Roman" w:eastAsia="Times New Roman" w:hAnsi="Times New Roman"/>
-        </w:rPr>
-        <w:t xml:space="preserve">Classe : le Rova (monument → matériel), un ohabolana (tradition orale → immatériel), un sorabe (document → matériel), le hiragasy (art du spectacle → immatériel), les terrasses betsileo (paysage construit → matériel).</w:t>
-      </w:r>
-    </w:p>
-    <w:p>
-      <w:pPr>
-        <w:spacing w:after="110" w:line="300"/>
-        <w:jc w:val="both"/>
-      </w:pPr>
-      <w:r>
-        <w:rPr>
-          <w:b/>
-          <w:bCs/>
-          <w:i w:val="false"/>
-          <w:iCs w:val="false"/>
-          <w:color w:val="B25000"/>
-          <w:sz w:val="24"/>
-          <w:szCs w:val="24"/>
-          <w:rFonts w:ascii="Times New Roman" w:cs="Times New Roman" w:eastAsia="Times New Roman" w:hAnsi="Times New Roman"/>
-        </w:rPr>
-        <w:t xml:space="preserve">Erreur à éviter — </w:t>
-      </w:r>
-      <w:r>
-        <w:rPr>
-          <w:b w:val="false"/>
-          <w:bCs w:val="false"/>
-          <w:i w:val="false"/>
-          <w:iCs w:val="false"/>
-          <w:color w:val="000000"/>
-          <w:sz w:val="24"/>
-          <w:szCs w:val="24"/>
-          <w:rFonts w:ascii="Times New Roman" w:cs="Times New Roman" w:eastAsia="Times New Roman" w:hAnsi="Times New Roman"/>
-        </w:rPr>
-        <w:t xml:space="preserve">Croire que seul l’ancien et le monumental fait patrimoine : un savoir-faire de vannerie, une recette, un chant de pêcheurs sont du patrimoine au même titre qu’un palais — et souvent plus menacés, car il suffit d’une génération qui ne pratique plus pour qu’ils meurent.</w:t>
-      </w:r>
-    </w:p>
-    <w:p>
-      <w:pPr>
-        <w:shd w:fill="E3F2FD" w:val="clear"/>
-        <w:spacing w:after="110" w:line="300"/>
-        <w:jc w:val="both"/>
-      </w:pPr>
-      <w:r>
-        <w:rPr>
-          <w:b/>
-          <w:bCs/>
-          <w:i w:val="false"/>
-          <w:iCs w:val="false"/>
-          <w:color w:val="1565C0"/>
-          <w:sz w:val="24"/>
-          <w:szCs w:val="24"/>
-          <w:rFonts w:ascii="Times New Roman" w:cs="Times New Roman" w:eastAsia="Times New Roman" w:hAnsi="Times New Roman"/>
-        </w:rPr>
-        <w:t xml:space="preserve">Le savais-tu ? </w:t>
-      </w:r>
-      <w:r>
-        <w:rPr>
-          <w:b w:val="false"/>
-          <w:bCs w:val="false"/>
-          <w:i w:val="false"/>
-          <w:iCs w:val="false"/>
-          <w:color w:val="000000"/>
-          <w:sz w:val="24"/>
-          <w:szCs w:val="24"/>
-          <w:rFonts w:ascii="Times New Roman" w:cs="Times New Roman" w:eastAsia="Times New Roman" w:hAnsi="Times New Roman"/>
-        </w:rPr>
-        <w:t xml:space="preserve">La colline royale d’Ambohimanga a été classée au patrimoine mondial de l’UNESCO en 2001 : ses bois sacrés, sa porte à disque de pierre — qu’une vingtaine d’hommes manœuvraient chaque soir ! — et sa cité royale en font un lieu unique. Et le kabary malgache, l’art oratoire des grandes occasions, est entré en 2021 au patrimoine immatériel de l’humanité : la parole malgache est désormais un trésor mondial.</w:t>
-      </w:r>
+          <w:sz w:val="26"/>
+          <w:szCs w:val="26"/>
+          <w:rFonts w:ascii="Times New Roman" w:cs="Times New Roman" w:eastAsia="Times New Roman" w:hAnsi="Times New Roman"/>
+        </w:rPr>
+        <w:t xml:space="preserve">Petit lexique</w:t>
+      </w:r>
+    </w:p>
+    <w:tbl>
+      <w:tblPr>
+        <w:tblW w:type="dxa" w:w="9600"/>
+        <w:tblBorders>
+          <w:top w:val="single" w:color="808080" w:sz="4"/>
+          <w:left w:val="single" w:color="808080" w:sz="4"/>
+          <w:bottom w:val="single" w:color="808080" w:sz="4"/>
+          <w:right w:val="single" w:color="808080" w:sz="4"/>
+          <w:insideH w:val="single" w:color="B0B0B0" w:sz="4"/>
+          <w:insideV w:val="single" w:color="B0B0B0" w:sz="4"/>
+        </w:tblBorders>
+        <w:tblLayout w:type="fixed"/>
+      </w:tblPr>
+      <w:tblGrid>
+        <w:gridCol w:w="2800"/>
+        <w:gridCol w:w="6800"/>
+      </w:tblGrid>
+      <w:tr>
+        <w:tc>
+          <w:tcPr>
+            <w:shd w:fill="E7E6E6" w:val="clear"/>
+            <w:tcMar>
+              <w:top w:type="dxa" w:w="80"/>
+              <w:left w:type="dxa" w:w="80"/>
+              <w:bottom w:type="dxa" w:w="80"/>
+              <w:right w:type="dxa" w:w="80"/>
+            </w:tcMar>
+          </w:tcPr>
+          <w:p>
+            <w:pPr>
+              <w:spacing w:after="40"/>
+              <w:jc w:val="left"/>
+            </w:pPr>
+            <w:r>
+              <w:rPr>
+                <w:b/>
+                <w:bCs/>
+                <w:i w:val="false"/>
+                <w:iCs w:val="false"/>
+                <w:color w:val="000000"/>
+                <w:sz w:val="20"/>
+                <w:szCs w:val="20"/>
+                <w:rFonts w:ascii="Times New Roman" w:cs="Times New Roman" w:eastAsia="Times New Roman" w:hAnsi="Times New Roman"/>
+              </w:rPr>
+              <w:t xml:space="preserve">Mot</w:t>
+            </w:r>
+          </w:p>
+        </w:tc>
+        <w:tc>
+          <w:tcPr>
+            <w:shd w:fill="E7E6E6" w:val="clear"/>
+            <w:tcMar>
+              <w:top w:type="dxa" w:w="80"/>
+              <w:left w:type="dxa" w:w="80"/>
+              <w:bottom w:type="dxa" w:w="80"/>
+              <w:right w:type="dxa" w:w="80"/>
+            </w:tcMar>
+          </w:tcPr>
+          <w:p>
+            <w:pPr>
+              <w:spacing w:after="40"/>
+              <w:jc w:val="left"/>
+            </w:pPr>
+            <w:r>
+              <w:rPr>
+                <w:b/>
+                <w:bCs/>
+                <w:i w:val="false"/>
+                <w:iCs w:val="false"/>
+                <w:color w:val="000000"/>
+                <w:sz w:val="20"/>
+                <w:szCs w:val="20"/>
+                <w:rFonts w:ascii="Times New Roman" w:cs="Times New Roman" w:eastAsia="Times New Roman" w:hAnsi="Times New Roman"/>
+              </w:rPr>
+              <w:t xml:space="preserve">Sens</w:t>
+            </w:r>
+          </w:p>
+        </w:tc>
+      </w:tr>
+      <w:tr>
+        <w:tc>
+          <w:tcPr>
+            <w:tcMar>
+              <w:top w:type="dxa" w:w="80"/>
+              <w:left w:type="dxa" w:w="80"/>
+              <w:bottom w:type="dxa" w:w="80"/>
+              <w:right w:type="dxa" w:w="80"/>
+            </w:tcMar>
+          </w:tcPr>
+          <w:p>
+            <w:pPr>
+              <w:spacing w:after="40"/>
+              <w:jc w:val="left"/>
+            </w:pPr>
+            <w:r>
+              <w:rPr>
+                <w:b/>
+                <w:bCs/>
+                <w:i w:val="false"/>
+                <w:iCs w:val="false"/>
+                <w:color w:val="000000"/>
+                <w:sz w:val="20"/>
+                <w:szCs w:val="20"/>
+                <w:rFonts w:ascii="Times New Roman" w:cs="Times New Roman" w:eastAsia="Times New Roman" w:hAnsi="Times New Roman"/>
+              </w:rPr>
+              <w:t xml:space="preserve">Patrimoine</w:t>
+            </w:r>
+          </w:p>
+        </w:tc>
+        <w:tc>
+          <w:tcPr>
+            <w:tcMar>
+              <w:top w:type="dxa" w:w="80"/>
+              <w:left w:type="dxa" w:w="80"/>
+              <w:bottom w:type="dxa" w:w="80"/>
+              <w:right w:type="dxa" w:w="80"/>
+            </w:tcMar>
+          </w:tcPr>
+          <w:p>
+            <w:pPr>
+              <w:spacing w:after="40"/>
+              <w:jc w:val="left"/>
+            </w:pPr>
+            <w:r>
+              <w:rPr>
+                <w:b w:val="false"/>
+                <w:bCs w:val="false"/>
+                <w:i w:val="false"/>
+                <w:iCs w:val="false"/>
+                <w:color w:val="000000"/>
+                <w:sz w:val="20"/>
+                <w:szCs w:val="20"/>
+                <w:rFonts w:ascii="Times New Roman" w:cs="Times New Roman" w:eastAsia="Times New Roman" w:hAnsi="Times New Roman"/>
+              </w:rPr>
+              <w:t xml:space="preserve">héritage reçu du passé et destiné à être transmis</w:t>
+            </w:r>
+          </w:p>
+        </w:tc>
+      </w:tr>
+      <w:tr>
+        <w:tc>
+          <w:tcPr>
+            <w:tcMar>
+              <w:top w:type="dxa" w:w="80"/>
+              <w:left w:type="dxa" w:w="80"/>
+              <w:bottom w:type="dxa" w:w="80"/>
+              <w:right w:type="dxa" w:w="80"/>
+            </w:tcMar>
+          </w:tcPr>
+          <w:p>
+            <w:pPr>
+              <w:spacing w:after="40"/>
+              <w:jc w:val="left"/>
+            </w:pPr>
+            <w:r>
+              <w:rPr>
+                <w:b/>
+                <w:bCs/>
+                <w:i w:val="false"/>
+                <w:iCs w:val="false"/>
+                <w:color w:val="000000"/>
+                <w:sz w:val="20"/>
+                <w:szCs w:val="20"/>
+                <w:rFonts w:ascii="Times New Roman" w:cs="Times New Roman" w:eastAsia="Times New Roman" w:hAnsi="Times New Roman"/>
+              </w:rPr>
+              <w:t xml:space="preserve">Matériel</w:t>
+            </w:r>
+          </w:p>
+        </w:tc>
+        <w:tc>
+          <w:tcPr>
+            <w:tcMar>
+              <w:top w:type="dxa" w:w="80"/>
+              <w:left w:type="dxa" w:w="80"/>
+              <w:bottom w:type="dxa" w:w="80"/>
+              <w:right w:type="dxa" w:w="80"/>
+            </w:tcMar>
+          </w:tcPr>
+          <w:p>
+            <w:pPr>
+              <w:spacing w:after="40"/>
+              <w:jc w:val="left"/>
+            </w:pPr>
+            <w:r>
+              <w:rPr>
+                <w:b w:val="false"/>
+                <w:bCs w:val="false"/>
+                <w:i w:val="false"/>
+                <w:iCs w:val="false"/>
+                <w:color w:val="000000"/>
+                <w:sz w:val="20"/>
+                <w:szCs w:val="20"/>
+                <w:rFonts w:ascii="Times New Roman" w:cs="Times New Roman" w:eastAsia="Times New Roman" w:hAnsi="Times New Roman"/>
+              </w:rPr>
+              <w:t xml:space="preserve">patrimoine concret : monuments, objets, documents</w:t>
+            </w:r>
+          </w:p>
+        </w:tc>
+      </w:tr>
+      <w:tr>
+        <w:tc>
+          <w:tcPr>
+            <w:tcMar>
+              <w:top w:type="dxa" w:w="80"/>
+              <w:left w:type="dxa" w:w="80"/>
+              <w:bottom w:type="dxa" w:w="80"/>
+              <w:right w:type="dxa" w:w="80"/>
+            </w:tcMar>
+          </w:tcPr>
+          <w:p>
+            <w:pPr>
+              <w:spacing w:after="40"/>
+              <w:jc w:val="left"/>
+            </w:pPr>
+            <w:r>
+              <w:rPr>
+                <w:b/>
+                <w:bCs/>
+                <w:i w:val="false"/>
+                <w:iCs w:val="false"/>
+                <w:color w:val="000000"/>
+                <w:sz w:val="20"/>
+                <w:szCs w:val="20"/>
+                <w:rFonts w:ascii="Times New Roman" w:cs="Times New Roman" w:eastAsia="Times New Roman" w:hAnsi="Times New Roman"/>
+              </w:rPr>
+              <w:t xml:space="preserve">Immatériel</w:t>
+            </w:r>
+          </w:p>
+        </w:tc>
+        <w:tc>
+          <w:tcPr>
+            <w:tcMar>
+              <w:top w:type="dxa" w:w="80"/>
+              <w:left w:type="dxa" w:w="80"/>
+              <w:bottom w:type="dxa" w:w="80"/>
+              <w:right w:type="dxa" w:w="80"/>
+            </w:tcMar>
+          </w:tcPr>
+          <w:p>
+            <w:pPr>
+              <w:spacing w:after="40"/>
+              <w:jc w:val="left"/>
+            </w:pPr>
+            <w:r>
+              <w:rPr>
+                <w:b w:val="false"/>
+                <w:bCs w:val="false"/>
+                <w:i w:val="false"/>
+                <w:iCs w:val="false"/>
+                <w:color w:val="000000"/>
+                <w:sz w:val="20"/>
+                <w:szCs w:val="20"/>
+                <w:rFonts w:ascii="Times New Roman" w:cs="Times New Roman" w:eastAsia="Times New Roman" w:hAnsi="Times New Roman"/>
+              </w:rPr>
+              <w:t xml:space="preserve">patrimoine vivant : pratiques, savoirs, expressions</w:t>
+            </w:r>
+          </w:p>
+        </w:tc>
+      </w:tr>
+      <w:tr>
+        <w:tc>
+          <w:tcPr>
+            <w:tcMar>
+              <w:top w:type="dxa" w:w="80"/>
+              <w:left w:type="dxa" w:w="80"/>
+              <w:bottom w:type="dxa" w:w="80"/>
+              <w:right w:type="dxa" w:w="80"/>
+            </w:tcMar>
+          </w:tcPr>
+          <w:p>
+            <w:pPr>
+              <w:spacing w:after="40"/>
+              <w:jc w:val="left"/>
+            </w:pPr>
+            <w:r>
+              <w:rPr>
+                <w:b/>
+                <w:bCs/>
+                <w:i w:val="false"/>
+                <w:iCs w:val="false"/>
+                <w:color w:val="000000"/>
+                <w:sz w:val="20"/>
+                <w:szCs w:val="20"/>
+                <w:rFonts w:ascii="Times New Roman" w:cs="Times New Roman" w:eastAsia="Times New Roman" w:hAnsi="Times New Roman"/>
+              </w:rPr>
+              <w:t xml:space="preserve">UNESCO</w:t>
+            </w:r>
+          </w:p>
+        </w:tc>
+        <w:tc>
+          <w:tcPr>
+            <w:tcMar>
+              <w:top w:type="dxa" w:w="80"/>
+              <w:left w:type="dxa" w:w="80"/>
+              <w:bottom w:type="dxa" w:w="80"/>
+              <w:right w:type="dxa" w:w="80"/>
+            </w:tcMar>
+          </w:tcPr>
+          <w:p>
+            <w:pPr>
+              <w:spacing w:after="40"/>
+              <w:jc w:val="left"/>
+            </w:pPr>
+            <w:r>
+              <w:rPr>
+                <w:b w:val="false"/>
+                <w:bCs w:val="false"/>
+                <w:i w:val="false"/>
+                <w:iCs w:val="false"/>
+                <w:color w:val="000000"/>
+                <w:sz w:val="20"/>
+                <w:szCs w:val="20"/>
+                <w:rFonts w:ascii="Times New Roman" w:cs="Times New Roman" w:eastAsia="Times New Roman" w:hAnsi="Times New Roman"/>
+              </w:rPr>
+              <w:t xml:space="preserve">organisation des Nations unies pour l’éducation, la science et la culture</w:t>
+            </w:r>
+          </w:p>
+        </w:tc>
+      </w:tr>
+    </w:tbl>
+    <w:p>
+      <w:pPr>
+        <w:spacing w:after="120"/>
+      </w:pPr>
     </w:p>
     <w:p>
       <w:pPr>
@@ -4708,152 +5877,152 @@
                 <w:szCs w:val="20"/>
                 <w:rFonts w:ascii="Times New Roman" w:cs="Times New Roman" w:eastAsia="Times New Roman" w:hAnsi="Times New Roman"/>
               </w:rPr>
-              <w:t xml:space="preserve">3. Observation</w:t>
-            </w:r>
-          </w:p>
-        </w:tc>
-        <w:tc>
-          <w:tcPr>
-            <w:tcMar>
-              <w:top w:type="dxa" w:w="80"/>
-              <w:left w:type="dxa" w:w="80"/>
-              <w:bottom w:type="dxa" w:w="80"/>
-              <w:right w:type="dxa" w:w="80"/>
-            </w:tcMar>
-          </w:tcPr>
-          <w:p>
-            <w:pPr>
-              <w:spacing w:after="40"/>
-              <w:jc w:val="left"/>
-            </w:pPr>
-            <w:r>
-              <w:rPr>
-                <w:b w:val="false"/>
-                <w:bCs w:val="false"/>
-                <w:i w:val="false"/>
-                <w:iCs w:val="false"/>
-                <w:color w:val="000000"/>
-                <w:sz w:val="20"/>
-                <w:szCs w:val="20"/>
-                <w:rFonts w:ascii="Times New Roman" w:cs="Times New Roman" w:eastAsia="Times New Roman" w:hAnsi="Times New Roman"/>
-              </w:rPr>
-              <w:t xml:space="preserve">Un projet de classe complet : inventorier les sites et traditions du fokontany (définir), monter une exposition à l’école (sensibiliser), alerter le fokontany sur une tombe ancienne menacée (protéger), enregistrer les contes d’une grand-mère (transmettre) — une enquête orale devenue acte de sauvegarde.</w:t>
-            </w:r>
-          </w:p>
-        </w:tc>
-        <w:tc>
-          <w:tcPr>
-            <w:tcMar>
-              <w:top w:type="dxa" w:w="80"/>
-              <w:left w:type="dxa" w:w="80"/>
-              <w:bottom w:type="dxa" w:w="80"/>
-              <w:right w:type="dxa" w:w="80"/>
-            </w:tcMar>
-          </w:tcPr>
-          <w:p>
-            <w:pPr>
-              <w:spacing w:after="40"/>
-              <w:jc w:val="left"/>
-            </w:pPr>
-            <w:r>
-              <w:rPr>
-                <w:b w:val="false"/>
-                <w:bCs w:val="false"/>
-                <w:i w:val="false"/>
-                <w:iCs w:val="false"/>
-                <w:color w:val="000000"/>
-                <w:sz w:val="20"/>
-                <w:szCs w:val="20"/>
-                <w:rFonts w:ascii="Times New Roman" w:cs="Times New Roman" w:eastAsia="Times New Roman" w:hAnsi="Times New Roman"/>
-              </w:rPr>
-              <w:t xml:space="preserve">Observent l’exemple résolu.</w:t>
-            </w:r>
-          </w:p>
-        </w:tc>
-        <w:tc>
-          <w:tcPr>
-            <w:tcMar>
-              <w:top w:type="dxa" w:w="80"/>
-              <w:left w:type="dxa" w:w="80"/>
-              <w:bottom w:type="dxa" w:w="80"/>
-              <w:right w:type="dxa" w:w="80"/>
-            </w:tcMar>
-          </w:tcPr>
-          <w:p>
-            <w:pPr>
-              <w:spacing w:after="40"/>
-              <w:jc w:val="left"/>
-            </w:pPr>
-            <w:r>
-              <w:rPr>
-                <w:b w:val="false"/>
-                <w:bCs w:val="false"/>
-                <w:i w:val="false"/>
-                <w:iCs w:val="false"/>
-                <w:color w:val="000000"/>
-                <w:sz w:val="20"/>
-                <w:szCs w:val="20"/>
-                <w:rFonts w:ascii="Times New Roman" w:cs="Times New Roman" w:eastAsia="Times New Roman" w:hAnsi="Times New Roman"/>
-              </w:rPr>
-              <w:t xml:space="preserve">Observation dirigée</w:t>
-            </w:r>
-          </w:p>
-        </w:tc>
-        <w:tc>
-          <w:tcPr>
-            <w:tcMar>
-              <w:top w:type="dxa" w:w="80"/>
-              <w:left w:type="dxa" w:w="80"/>
-              <w:bottom w:type="dxa" w:w="80"/>
-              <w:right w:type="dxa" w:w="80"/>
-            </w:tcMar>
-          </w:tcPr>
-          <w:p>
-            <w:pPr>
-              <w:spacing w:after="40"/>
-              <w:jc w:val="left"/>
-            </w:pPr>
-            <w:r>
-              <w:rPr>
-                <w:b w:val="false"/>
-                <w:bCs w:val="false"/>
-                <w:i w:val="false"/>
-                <w:iCs w:val="false"/>
-                <w:color w:val="000000"/>
-                <w:sz w:val="20"/>
-                <w:szCs w:val="20"/>
-                <w:rFonts w:ascii="Times New Roman" w:cs="Times New Roman" w:eastAsia="Times New Roman" w:hAnsi="Times New Roman"/>
-              </w:rPr>
-              <w:t xml:space="preserve">Document imprimé</w:t>
-            </w:r>
-          </w:p>
-        </w:tc>
-        <w:tc>
-          <w:tcPr>
-            <w:tcMar>
-              <w:top w:type="dxa" w:w="80"/>
-              <w:left w:type="dxa" w:w="80"/>
-              <w:bottom w:type="dxa" w:w="80"/>
-              <w:right w:type="dxa" w:w="80"/>
-            </w:tcMar>
-          </w:tcPr>
-          <w:p>
-            <w:pPr>
-              <w:spacing w:after="40"/>
-              <w:jc w:val="left"/>
-            </w:pPr>
-            <w:r>
-              <w:rPr>
-                <w:b w:val="false"/>
-                <w:bCs w:val="false"/>
-                <w:i w:val="false"/>
-                <w:iCs w:val="false"/>
-                <w:color w:val="000000"/>
-                <w:sz w:val="20"/>
-                <w:szCs w:val="20"/>
-                <w:rFonts w:ascii="Times New Roman" w:cs="Times New Roman" w:eastAsia="Times New Roman" w:hAnsi="Times New Roman"/>
-              </w:rPr>
-              <w:t xml:space="preserve">Compréhension</w:t>
+              <w:t xml:space="preserve">3. Développement</w:t>
+            </w:r>
+          </w:p>
+        </w:tc>
+        <w:tc>
+          <w:tcPr>
+            <w:tcMar>
+              <w:top w:type="dxa" w:w="80"/>
+              <w:left w:type="dxa" w:w="80"/>
+              <w:bottom w:type="dxa" w:w="80"/>
+              <w:right w:type="dxa" w:w="80"/>
+            </w:tcMar>
+          </w:tcPr>
+          <w:p>
+            <w:pPr>
+              <w:spacing w:after="40"/>
+              <w:jc w:val="left"/>
+            </w:pPr>
+            <w:r>
+              <w:rPr>
+                <w:b w:val="false"/>
+                <w:bCs w:val="false"/>
+                <w:i w:val="false"/>
+                <w:iCs w:val="false"/>
+                <w:color w:val="000000"/>
+                <w:sz w:val="20"/>
+                <w:szCs w:val="20"/>
+                <w:rFonts w:ascii="Times New Roman" w:cs="Times New Roman" w:eastAsia="Times New Roman" w:hAnsi="Times New Roman"/>
+              </w:rPr>
+              <w:t xml:space="preserve">Développe la leçon partie par partie : Pourquoi protéger ? ; Comment protéger ? La chaîne à cinq maillons ; La boucle de l’année se referme.</w:t>
+            </w:r>
+          </w:p>
+        </w:tc>
+        <w:tc>
+          <w:tcPr>
+            <w:tcMar>
+              <w:top w:type="dxa" w:w="80"/>
+              <w:left w:type="dxa" w:w="80"/>
+              <w:bottom w:type="dxa" w:w="80"/>
+              <w:right w:type="dxa" w:w="80"/>
+            </w:tcMar>
+          </w:tcPr>
+          <w:p>
+            <w:pPr>
+              <w:spacing w:after="40"/>
+              <w:jc w:val="left"/>
+            </w:pPr>
+            <w:r>
+              <w:rPr>
+                <w:b w:val="false"/>
+                <w:bCs w:val="false"/>
+                <w:i w:val="false"/>
+                <w:iCs w:val="false"/>
+                <w:color w:val="000000"/>
+                <w:sz w:val="20"/>
+                <w:szCs w:val="20"/>
+                <w:rFonts w:ascii="Times New Roman" w:cs="Times New Roman" w:eastAsia="Times New Roman" w:hAnsi="Times New Roman"/>
+              </w:rPr>
+              <w:t xml:space="preserve">Écoutent, répondent aux questions et notent les mots-clés.</w:t>
+            </w:r>
+          </w:p>
+        </w:tc>
+        <w:tc>
+          <w:tcPr>
+            <w:tcMar>
+              <w:top w:type="dxa" w:w="80"/>
+              <w:left w:type="dxa" w:w="80"/>
+              <w:bottom w:type="dxa" w:w="80"/>
+              <w:right w:type="dxa" w:w="80"/>
+            </w:tcMar>
+          </w:tcPr>
+          <w:p>
+            <w:pPr>
+              <w:spacing w:after="40"/>
+              <w:jc w:val="left"/>
+            </w:pPr>
+            <w:r>
+              <w:rPr>
+                <w:b w:val="false"/>
+                <w:bCs w:val="false"/>
+                <w:i w:val="false"/>
+                <w:iCs w:val="false"/>
+                <w:color w:val="000000"/>
+                <w:sz w:val="20"/>
+                <w:szCs w:val="20"/>
+                <w:rFonts w:ascii="Times New Roman" w:cs="Times New Roman" w:eastAsia="Times New Roman" w:hAnsi="Times New Roman"/>
+              </w:rPr>
+              <w:t xml:space="preserve">Exposé interactif, questions-réponses</w:t>
+            </w:r>
+          </w:p>
+        </w:tc>
+        <w:tc>
+          <w:tcPr>
+            <w:tcMar>
+              <w:top w:type="dxa" w:w="80"/>
+              <w:left w:type="dxa" w:w="80"/>
+              <w:bottom w:type="dxa" w:w="80"/>
+              <w:right w:type="dxa" w:w="80"/>
+            </w:tcMar>
+          </w:tcPr>
+          <w:p>
+            <w:pPr>
+              <w:spacing w:after="40"/>
+              <w:jc w:val="left"/>
+            </w:pPr>
+            <w:r>
+              <w:rPr>
+                <w:b w:val="false"/>
+                <w:bCs w:val="false"/>
+                <w:i w:val="false"/>
+                <w:iCs w:val="false"/>
+                <w:color w:val="000000"/>
+                <w:sz w:val="20"/>
+                <w:szCs w:val="20"/>
+                <w:rFonts w:ascii="Times New Roman" w:cs="Times New Roman" w:eastAsia="Times New Roman" w:hAnsi="Times New Roman"/>
+              </w:rPr>
+              <w:t xml:space="preserve">Tableau, frises, cartes</w:t>
+            </w:r>
+          </w:p>
+        </w:tc>
+        <w:tc>
+          <w:tcPr>
+            <w:tcMar>
+              <w:top w:type="dxa" w:w="80"/>
+              <w:left w:type="dxa" w:w="80"/>
+              <w:bottom w:type="dxa" w:w="80"/>
+              <w:right w:type="dxa" w:w="80"/>
+            </w:tcMar>
+          </w:tcPr>
+          <w:p>
+            <w:pPr>
+              <w:spacing w:after="40"/>
+              <w:jc w:val="left"/>
+            </w:pPr>
+            <w:r>
+              <w:rPr>
+                <w:b w:val="false"/>
+                <w:bCs w:val="false"/>
+                <w:i w:val="false"/>
+                <w:iCs w:val="false"/>
+                <w:color w:val="000000"/>
+                <w:sz w:val="20"/>
+                <w:szCs w:val="20"/>
+                <w:rFonts w:ascii="Times New Roman" w:cs="Times New Roman" w:eastAsia="Times New Roman" w:hAnsi="Times New Roman"/>
+              </w:rPr>
+              <w:t xml:space="preserve">Attention, participation</w:t>
             </w:r>
           </w:p>
         </w:tc>
@@ -4884,152 +6053,152 @@
                 <w:szCs w:val="20"/>
                 <w:rFonts w:ascii="Times New Roman" w:cs="Times New Roman" w:eastAsia="Times New Roman" w:hAnsi="Times New Roman"/>
               </w:rPr>
-              <w:t xml:space="preserve">4. Analyse</w:t>
-            </w:r>
-          </w:p>
-        </w:tc>
-        <w:tc>
-          <w:tcPr>
-            <w:tcMar>
-              <w:top w:type="dxa" w:w="80"/>
-              <w:left w:type="dxa" w:w="80"/>
-              <w:bottom w:type="dxa" w:w="80"/>
-              <w:right w:type="dxa" w:w="80"/>
-            </w:tcMar>
-          </w:tcPr>
-          <w:p>
-            <w:pPr>
-              <w:spacing w:after="40"/>
-              <w:jc w:val="left"/>
-            </w:pPr>
-            <w:r>
-              <w:rPr>
-                <w:b w:val="false"/>
-                <w:bCs w:val="false"/>
-                <w:i w:val="false"/>
-                <w:iCs w:val="false"/>
-                <w:color w:val="000000"/>
-                <w:sz w:val="20"/>
-                <w:szCs w:val="20"/>
-                <w:rFonts w:ascii="Times New Roman" w:cs="Times New Roman" w:eastAsia="Times New Roman" w:hAnsi="Times New Roman"/>
-              </w:rPr>
-              <w:t xml:space="preserve">Guide l’analyse : Pourquoi protéger ? Parce que le patrimoine historique est la mémoire collective de la nation : il raconte d’où nous venons, il fonde l’identité commune — un peuple qui perd son patrimoine perd une part de lui-même ; parce qu’il est irremplaçable : un monument brûlé, un conte oublié ne reviennent pas ; et parce qu’il est une richesse d’avenir — le tourisme culturel, les métiers d’art en vivent. Comment protéger ? La chaîne a cinq maillons. Définir : inventorier ce qui fait patrimoine — c’est le travail des historiens, des musées, des communautés elles-mêmes. Sensibiliser : expliquer sa valeur à tous — par l’école, les médias, les journées du patrimoine ; on ne respecte que ce qu’on comprend. Protéger par la loi : Madagascar s’est doté d’une législation sur la protection du patrimoine national, qui classe les biens culturels, interdit leur destruction, leur pillage et leur sortie du territoire, et punit les contrevenants ; les conventions de l’UNESCO complètent cette protection au niveau mondial. Transmettre : le patrimoine immatériel surtout ne survit que par la transmission — les coutumes, les contes, les danses, les traditions culinaires, les savoir-faire doivent passer des anciens aux jeunes : c’est l’affaire des familles, des associations, de l’école… et la tienne. Entretenir la mémoire collective enfin : commémorations, musées, enseignement de l’Histoire — ce manuel lui-même y participe. La boucle de l’année se referme : à l’unité I, tu as appris à recueillir la mémoire des anciens ; tu sais maintenant pourquoi ce geste est vital — chaque enquête orale, chaque conte noté, chaque visite d’un site est un acte de sauvegarde. Le patrimoine n’a pas de meilleurs gardiens que ceux qui l’aiment et le connaissent : vous.</w:t>
-            </w:r>
-          </w:p>
-        </w:tc>
-        <w:tc>
-          <w:tcPr>
-            <w:tcMar>
-              <w:top w:type="dxa" w:w="80"/>
-              <w:left w:type="dxa" w:w="80"/>
-              <w:bottom w:type="dxa" w:w="80"/>
-              <w:right w:type="dxa" w:w="80"/>
-            </w:tcMar>
-          </w:tcPr>
-          <w:p>
-            <w:pPr>
-              <w:spacing w:after="40"/>
-              <w:jc w:val="left"/>
-            </w:pPr>
-            <w:r>
-              <w:rPr>
-                <w:b w:val="false"/>
-                <w:bCs w:val="false"/>
-                <w:i w:val="false"/>
-                <w:iCs w:val="false"/>
-                <w:color w:val="000000"/>
-                <w:sz w:val="20"/>
-                <w:szCs w:val="20"/>
-                <w:rFonts w:ascii="Times New Roman" w:cs="Times New Roman" w:eastAsia="Times New Roman" w:hAnsi="Times New Roman"/>
-              </w:rPr>
-              <w:t xml:space="preserve">Expliquent la démarche et vérifient le résultat.</w:t>
-            </w:r>
-          </w:p>
-        </w:tc>
-        <w:tc>
-          <w:tcPr>
-            <w:tcMar>
-              <w:top w:type="dxa" w:w="80"/>
-              <w:left w:type="dxa" w:w="80"/>
-              <w:bottom w:type="dxa" w:w="80"/>
-              <w:right w:type="dxa" w:w="80"/>
-            </w:tcMar>
-          </w:tcPr>
-          <w:p>
-            <w:pPr>
-              <w:spacing w:after="40"/>
-              <w:jc w:val="left"/>
-            </w:pPr>
-            <w:r>
-              <w:rPr>
-                <w:b w:val="false"/>
-                <w:bCs w:val="false"/>
-                <w:i w:val="false"/>
-                <w:iCs w:val="false"/>
-                <w:color w:val="000000"/>
-                <w:sz w:val="20"/>
-                <w:szCs w:val="20"/>
-                <w:rFonts w:ascii="Times New Roman" w:cs="Times New Roman" w:eastAsia="Times New Roman" w:hAnsi="Times New Roman"/>
-              </w:rPr>
-              <w:t xml:space="preserve">Recherche en binômes</w:t>
-            </w:r>
-          </w:p>
-        </w:tc>
-        <w:tc>
-          <w:tcPr>
-            <w:tcMar>
-              <w:top w:type="dxa" w:w="80"/>
-              <w:left w:type="dxa" w:w="80"/>
-              <w:bottom w:type="dxa" w:w="80"/>
-              <w:right w:type="dxa" w:w="80"/>
-            </w:tcMar>
-          </w:tcPr>
-          <w:p>
-            <w:pPr>
-              <w:spacing w:after="40"/>
-              <w:jc w:val="left"/>
-            </w:pPr>
-            <w:r>
-              <w:rPr>
-                <w:b w:val="false"/>
-                <w:bCs w:val="false"/>
-                <w:i w:val="false"/>
-                <w:iCs w:val="false"/>
-                <w:color w:val="000000"/>
-                <w:sz w:val="20"/>
-                <w:szCs w:val="20"/>
-                <w:rFonts w:ascii="Times New Roman" w:cs="Times New Roman" w:eastAsia="Times New Roman" w:hAnsi="Times New Roman"/>
-              </w:rPr>
-              <w:t xml:space="preserve">Documents, cartes, frises</w:t>
-            </w:r>
-          </w:p>
-        </w:tc>
-        <w:tc>
-          <w:tcPr>
-            <w:tcMar>
-              <w:top w:type="dxa" w:w="80"/>
-              <w:left w:type="dxa" w:w="80"/>
-              <w:bottom w:type="dxa" w:w="80"/>
-              <w:right w:type="dxa" w:w="80"/>
-            </w:tcMar>
-          </w:tcPr>
-          <w:p>
-            <w:pPr>
-              <w:spacing w:after="40"/>
-              <w:jc w:val="left"/>
-            </w:pPr>
-            <w:r>
-              <w:rPr>
-                <w:b w:val="false"/>
-                <w:bCs w:val="false"/>
-                <w:i w:val="false"/>
-                <w:iCs w:val="false"/>
-                <w:color w:val="000000"/>
-                <w:sz w:val="20"/>
-                <w:szCs w:val="20"/>
-                <w:rFonts w:ascii="Times New Roman" w:cs="Times New Roman" w:eastAsia="Times New Roman" w:hAnsi="Times New Roman"/>
-              </w:rPr>
-              <w:t xml:space="preserve">Raisonnement</w:t>
+              <w:t xml:space="preserve">4. Étude de document</w:t>
+            </w:r>
+          </w:p>
+        </w:tc>
+        <w:tc>
+          <w:tcPr>
+            <w:tcMar>
+              <w:top w:type="dxa" w:w="80"/>
+              <w:left w:type="dxa" w:w="80"/>
+              <w:bottom w:type="dxa" w:w="80"/>
+              <w:right w:type="dxa" w:w="80"/>
+            </w:tcMar>
+          </w:tcPr>
+          <w:p>
+            <w:pPr>
+              <w:spacing w:after="40"/>
+              <w:jc w:val="left"/>
+            </w:pPr>
+            <w:r>
+              <w:rPr>
+                <w:b w:val="false"/>
+                <w:bCs w:val="false"/>
+                <w:i w:val="false"/>
+                <w:iCs w:val="false"/>
+                <w:color w:val="000000"/>
+                <w:sz w:val="20"/>
+                <w:szCs w:val="20"/>
+                <w:rFonts w:ascii="Times New Roman" w:cs="Times New Roman" w:eastAsia="Times New Roman" w:hAnsi="Times New Roman"/>
+              </w:rPr>
+              <w:t xml:space="preserve">Fait lire le document « La loi malgache protège le patrimoine national » (d’après l’ordonnance n° 82-029 relative à la sauvegarde, la protection et la conservation du patrimoine national (Madagascar, 1982) — extraits adaptés), puis pose les questions.</w:t>
+            </w:r>
+          </w:p>
+        </w:tc>
+        <w:tc>
+          <w:tcPr>
+            <w:tcMar>
+              <w:top w:type="dxa" w:w="80"/>
+              <w:left w:type="dxa" w:w="80"/>
+              <w:bottom w:type="dxa" w:w="80"/>
+              <w:right w:type="dxa" w:w="80"/>
+            </w:tcMar>
+          </w:tcPr>
+          <w:p>
+            <w:pPr>
+              <w:spacing w:after="40"/>
+              <w:jc w:val="left"/>
+            </w:pPr>
+            <w:r>
+              <w:rPr>
+                <w:b w:val="false"/>
+                <w:bCs w:val="false"/>
+                <w:i w:val="false"/>
+                <w:iCs w:val="false"/>
+                <w:color w:val="000000"/>
+                <w:sz w:val="20"/>
+                <w:szCs w:val="20"/>
+                <w:rFonts w:ascii="Times New Roman" w:cs="Times New Roman" w:eastAsia="Times New Roman" w:hAnsi="Times New Roman"/>
+              </w:rPr>
+              <w:t xml:space="preserve">Lisent le document, répondent aux questions et critiquent la source.</w:t>
+            </w:r>
+          </w:p>
+        </w:tc>
+        <w:tc>
+          <w:tcPr>
+            <w:tcMar>
+              <w:top w:type="dxa" w:w="80"/>
+              <w:left w:type="dxa" w:w="80"/>
+              <w:bottom w:type="dxa" w:w="80"/>
+              <w:right w:type="dxa" w:w="80"/>
+            </w:tcMar>
+          </w:tcPr>
+          <w:p>
+            <w:pPr>
+              <w:spacing w:after="40"/>
+              <w:jc w:val="left"/>
+            </w:pPr>
+            <w:r>
+              <w:rPr>
+                <w:b w:val="false"/>
+                <w:bCs w:val="false"/>
+                <w:i w:val="false"/>
+                <w:iCs w:val="false"/>
+                <w:color w:val="000000"/>
+                <w:sz w:val="20"/>
+                <w:szCs w:val="20"/>
+                <w:rFonts w:ascii="Times New Roman" w:cs="Times New Roman" w:eastAsia="Times New Roman" w:hAnsi="Times New Roman"/>
+              </w:rPr>
+              <w:t xml:space="preserve">Observation dirigée, travail en binômes</w:t>
+            </w:r>
+          </w:p>
+        </w:tc>
+        <w:tc>
+          <w:tcPr>
+            <w:tcMar>
+              <w:top w:type="dxa" w:w="80"/>
+              <w:left w:type="dxa" w:w="80"/>
+              <w:bottom w:type="dxa" w:w="80"/>
+              <w:right w:type="dxa" w:w="80"/>
+            </w:tcMar>
+          </w:tcPr>
+          <w:p>
+            <w:pPr>
+              <w:spacing w:after="40"/>
+              <w:jc w:val="left"/>
+            </w:pPr>
+            <w:r>
+              <w:rPr>
+                <w:b w:val="false"/>
+                <w:bCs w:val="false"/>
+                <w:i w:val="false"/>
+                <w:iCs w:val="false"/>
+                <w:color w:val="000000"/>
+                <w:sz w:val="20"/>
+                <w:szCs w:val="20"/>
+                <w:rFonts w:ascii="Times New Roman" w:cs="Times New Roman" w:eastAsia="Times New Roman" w:hAnsi="Times New Roman"/>
+              </w:rPr>
+              <w:t xml:space="preserve">Document imprimé</w:t>
+            </w:r>
+          </w:p>
+        </w:tc>
+        <w:tc>
+          <w:tcPr>
+            <w:tcMar>
+              <w:top w:type="dxa" w:w="80"/>
+              <w:left w:type="dxa" w:w="80"/>
+              <w:bottom w:type="dxa" w:w="80"/>
+              <w:right w:type="dxa" w:w="80"/>
+            </w:tcMar>
+          </w:tcPr>
+          <w:p>
+            <w:pPr>
+              <w:spacing w:after="40"/>
+              <w:jc w:val="left"/>
+            </w:pPr>
+            <w:r>
+              <w:rPr>
+                <w:b w:val="false"/>
+                <w:bCs w:val="false"/>
+                <w:i w:val="false"/>
+                <w:iCs w:val="false"/>
+                <w:color w:val="000000"/>
+                <w:sz w:val="20"/>
+                <w:szCs w:val="20"/>
+                <w:rFonts w:ascii="Times New Roman" w:cs="Times New Roman" w:eastAsia="Times New Roman" w:hAnsi="Times New Roman"/>
+              </w:rPr>
+              <w:t xml:space="preserve">Esprit critique</w:t>
             </w:r>
           </w:p>
         </w:tc>
@@ -5635,7 +6804,26 @@
     </w:p>
     <w:p>
       <w:pPr>
-        <w:spacing w:after="110" w:line="300"/>
+        <w:spacing w:after="160" w:line="300"/>
+        <w:jc w:val="center"/>
+      </w:pPr>
+      <w:r>
+        <w:rPr>
+          <w:b w:val="false"/>
+          <w:bCs w:val="false"/>
+          <w:i/>
+          <w:iCs/>
+          <w:color w:val="000000"/>
+          <w:sz w:val="21"/>
+          <w:szCs w:val="21"/>
+          <w:rFonts w:ascii="Times New Roman" w:cs="Times New Roman" w:eastAsia="Times New Roman" w:hAnsi="Times New Roman"/>
+        </w:rPr>
+        <w:t xml:space="preserve">Un monument brûlé, un conte oublié ne reviennent pas : le patrimoine ne se garde pas tout seul.</w:t>
+      </w:r>
+    </w:p>
+    <w:p>
+      <w:pPr>
+        <w:spacing w:after="80" w:line="300"/>
         <w:jc w:val="both"/>
       </w:pPr>
       <w:r>
@@ -5645,11 +6833,30 @@
           <w:i w:val="false"/>
           <w:iCs w:val="false"/>
           <w:color w:val="2E7D32"/>
-          <w:sz w:val="24"/>
-          <w:szCs w:val="24"/>
-          <w:rFonts w:ascii="Times New Roman" w:cs="Times New Roman" w:eastAsia="Times New Roman" w:hAnsi="Times New Roman"/>
-        </w:rPr>
-        <w:t xml:space="preserve">Définition — </w:t>
+          <w:sz w:val="26"/>
+          <w:szCs w:val="26"/>
+          <w:rFonts w:ascii="Times New Roman" w:cs="Times New Roman" w:eastAsia="Times New Roman" w:hAnsi="Times New Roman"/>
+        </w:rPr>
+        <w:t xml:space="preserve">1. Pourquoi protéger ?</w:t>
+      </w:r>
+    </w:p>
+    <w:p>
+      <w:pPr>
+        <w:spacing w:after="100" w:line="300"/>
+        <w:jc w:val="both"/>
+      </w:pPr>
+      <w:r>
+        <w:rPr>
+          <w:b w:val="false"/>
+          <w:bCs w:val="false"/>
+          <w:i w:val="false"/>
+          <w:iCs w:val="false"/>
+          <w:color w:val="000000"/>
+          <w:sz w:val="24"/>
+          <w:szCs w:val="24"/>
+          <w:rFonts w:ascii="Times New Roman" w:cs="Times New Roman" w:eastAsia="Times New Roman" w:hAnsi="Times New Roman"/>
+        </w:rPr>
+        <w:t xml:space="preserve">Trois raisons commandent la </w:t>
       </w:r>
       <w:r>
         <w:rPr>
@@ -5657,19 +6864,45 @@
           <w:bCs/>
           <w:i w:val="false"/>
           <w:iCs w:val="false"/>
+          <w:color w:val="1F4E79"/>
+          <w:sz w:val="24"/>
+          <w:szCs w:val="24"/>
+          <w:rFonts w:ascii="Times New Roman" w:cs="Times New Roman" w:eastAsia="Times New Roman" w:hAnsi="Times New Roman"/>
+        </w:rPr>
+        <w:t xml:space="preserve">sauvegarde</w:t>
+      </w:r>
+      <w:r>
+        <w:rPr>
+          <w:b w:val="false"/>
+          <w:bCs w:val="false"/>
+          <w:i w:val="false"/>
+          <w:iCs w:val="false"/>
           <w:color w:val="000000"/>
           <w:sz w:val="24"/>
           <w:szCs w:val="24"/>
           <w:rFonts w:ascii="Times New Roman" w:cs="Times New Roman" w:eastAsia="Times New Roman" w:hAnsi="Times New Roman"/>
         </w:rPr>
-        <w:t xml:space="preserve">Les patrimoines historiques — matériels (monuments, sites, objets, documents) et immatériels (coutumes, contes, danses, traditions culinaires, savoir-faire) — doivent être sauvegardés. Leur protection suit une chaîne : les définir, sensibiliser la population à leur valeur, appliquer la loi de protection du patrimoine, les transmettre aux jeunes générations, et entretenir ainsi la mémoire collective de la nation.</w:t>
-      </w:r>
-    </w:p>
-    <w:p>
-      <w:pPr>
-        <w:spacing w:after="110" w:line="300"/>
+        <w:t xml:space="preserve"> :</w:t>
+      </w:r>
+    </w:p>
+    <w:p>
+      <w:pPr>
+        <w:spacing w:after="60" w:line="300"/>
         <w:jc w:val="both"/>
       </w:pPr>
+      <w:r>
+        <w:rPr>
+          <w:b w:val="false"/>
+          <w:bCs w:val="false"/>
+          <w:i w:val="false"/>
+          <w:iCs w:val="false"/>
+          <w:color w:val="000000"/>
+          <w:sz w:val="24"/>
+          <w:szCs w:val="24"/>
+          <w:rFonts w:ascii="Times New Roman" w:cs="Times New Roman" w:eastAsia="Times New Roman" w:hAnsi="Times New Roman"/>
+        </w:rPr>
+        <w:t xml:space="preserve">• le patrimoine historique est la </w:t>
+      </w:r>
       <w:r>
         <w:rPr>
           <w:b/>
@@ -5681,7 +6914,7 @@
           <w:szCs w:val="24"/>
           <w:rFonts w:ascii="Times New Roman" w:cs="Times New Roman" w:eastAsia="Times New Roman" w:hAnsi="Times New Roman"/>
         </w:rPr>
-        <w:t xml:space="preserve">Autrement dit : </w:t>
+        <w:t xml:space="preserve">mémoire collective</w:t>
       </w:r>
       <w:r>
         <w:rPr>
@@ -5694,14 +6927,21 @@
           <w:szCs w:val="24"/>
           <w:rFonts w:ascii="Times New Roman" w:cs="Times New Roman" w:eastAsia="Times New Roman" w:hAnsi="Times New Roman"/>
         </w:rPr>
-        <w:t xml:space="preserve">protéger le patrimoine, c’est d’abord savoir ce qu’on possède, puis en faire comprendre la valeur, le défendre par la loi, l’enseigner aux jeunes — pour que la nation n’oublie jamais qui elle est.</w:t>
-      </w:r>
-    </w:p>
-    <w:p>
-      <w:pPr>
-        <w:spacing w:after="110" w:line="300"/>
-        <w:jc w:val="both"/>
-      </w:pPr>
+        <w:t xml:space="preserve"> de la nation : il raconte d’où nous venons, il fonde l’</w:t>
+      </w:r>
+      <w:r>
+        <w:rPr>
+          <w:b/>
+          <w:bCs/>
+          <w:i w:val="false"/>
+          <w:iCs w:val="false"/>
+          <w:color w:val="1F4E79"/>
+          <w:sz w:val="24"/>
+          <w:szCs w:val="24"/>
+          <w:rFonts w:ascii="Times New Roman" w:cs="Times New Roman" w:eastAsia="Times New Roman" w:hAnsi="Times New Roman"/>
+        </w:rPr>
+        <w:t xml:space="preserve">identité</w:t>
+      </w:r>
       <w:r>
         <w:rPr>
           <w:b w:val="false"/>
@@ -5713,7 +6953,424 @@
           <w:szCs w:val="24"/>
           <w:rFonts w:ascii="Times New Roman" w:cs="Times New Roman" w:eastAsia="Times New Roman" w:hAnsi="Times New Roman"/>
         </w:rPr>
-        <w:t xml:space="preserve">Pourquoi protéger ? Parce que le patrimoine historique est la mémoire collective de la nation : il raconte d’où nous venons, il fonde l’identité commune — un peuple qui perd son patrimoine perd une part de lui-même ; parce qu’il est irremplaçable : un monument brûlé, un conte oublié ne reviennent pas ; et parce qu’il est une richesse d’avenir — le tourisme culturel, les métiers d’art en vivent. Comment protéger ? La chaîne a cinq maillons. Définir : inventorier ce qui fait patrimoine — c’est le travail des historiens, des musées, des communautés elles-mêmes. Sensibiliser : expliquer sa valeur à tous — par l’école, les médias, les journées du patrimoine ; on ne respecte que ce qu’on comprend. Protéger par la loi : Madagascar s’est doté d’une législation sur la protection du patrimoine national, qui classe les biens culturels, interdit leur destruction, leur pillage et leur sortie du territoire, et punit les contrevenants ; les conventions de l’UNESCO complètent cette protection au niveau mondial. Transmettre : le patrimoine immatériel surtout ne survit que par la transmission — les coutumes, les contes, les danses, les traditions culinaires, les savoir-faire doivent passer des anciens aux jeunes : c’est l’affaire des familles, des associations, de l’école… et la tienne. Entretenir la mémoire collective enfin : commémorations, musées, enseignement de l’Histoire — ce manuel lui-même y participe. La boucle de l’année se referme : à l’unité I, tu as appris à recueillir la mémoire des anciens ; tu sais maintenant pourquoi ce geste est vital — chaque enquête orale, chaque conte noté, chaque visite d’un site est un acte de sauvegarde. Le patrimoine n’a pas de meilleurs gardiens que ceux qui l’aiment et le connaissent : vous.</w:t>
+        <w:t xml:space="preserve"> commune — un peuple qui perd son patrimoine perd une part de lui-même ;</w:t>
+      </w:r>
+    </w:p>
+    <w:p>
+      <w:pPr>
+        <w:spacing w:after="60" w:line="300"/>
+        <w:jc w:val="both"/>
+      </w:pPr>
+      <w:r>
+        <w:rPr>
+          <w:b w:val="false"/>
+          <w:bCs w:val="false"/>
+          <w:i w:val="false"/>
+          <w:iCs w:val="false"/>
+          <w:color w:val="000000"/>
+          <w:sz w:val="24"/>
+          <w:szCs w:val="24"/>
+          <w:rFonts w:ascii="Times New Roman" w:cs="Times New Roman" w:eastAsia="Times New Roman" w:hAnsi="Times New Roman"/>
+        </w:rPr>
+        <w:t xml:space="preserve">• il est irremplaçable : un monument brûlé, un conte oublié ne reviennent pas ;</w:t>
+      </w:r>
+    </w:p>
+    <w:p>
+      <w:pPr>
+        <w:spacing w:after="60" w:line="300"/>
+        <w:jc w:val="both"/>
+      </w:pPr>
+      <w:r>
+        <w:rPr>
+          <w:b w:val="false"/>
+          <w:bCs w:val="false"/>
+          <w:i w:val="false"/>
+          <w:iCs w:val="false"/>
+          <w:color w:val="000000"/>
+          <w:sz w:val="24"/>
+          <w:szCs w:val="24"/>
+          <w:rFonts w:ascii="Times New Roman" w:cs="Times New Roman" w:eastAsia="Times New Roman" w:hAnsi="Times New Roman"/>
+        </w:rPr>
+        <w:t xml:space="preserve">• il est une richesse d’avenir — le tourisme culturel, les métiers d’art en vivent.</w:t>
+      </w:r>
+    </w:p>
+    <w:p>
+      <w:pPr>
+        <w:spacing w:after="80" w:line="300"/>
+        <w:jc w:val="both"/>
+      </w:pPr>
+      <w:r>
+        <w:rPr>
+          <w:b/>
+          <w:bCs/>
+          <w:i w:val="false"/>
+          <w:iCs w:val="false"/>
+          <w:color w:val="2E7D32"/>
+          <w:sz w:val="26"/>
+          <w:szCs w:val="26"/>
+          <w:rFonts w:ascii="Times New Roman" w:cs="Times New Roman" w:eastAsia="Times New Roman" w:hAnsi="Times New Roman"/>
+        </w:rPr>
+        <w:t xml:space="preserve">2. Comment protéger ? La chaîne à cinq maillons</w:t>
+      </w:r>
+    </w:p>
+    <w:p>
+      <w:pPr>
+        <w:spacing w:after="100" w:line="300"/>
+        <w:jc w:val="both"/>
+      </w:pPr>
+      <w:r>
+        <w:rPr>
+          <w:b w:val="false"/>
+          <w:bCs w:val="false"/>
+          <w:i w:val="false"/>
+          <w:iCs w:val="false"/>
+          <w:color w:val="000000"/>
+          <w:sz w:val="24"/>
+          <w:szCs w:val="24"/>
+          <w:rFonts w:ascii="Times New Roman" w:cs="Times New Roman" w:eastAsia="Times New Roman" w:hAnsi="Times New Roman"/>
+        </w:rPr>
+        <w:t xml:space="preserve">La </w:t>
+      </w:r>
+      <w:r>
+        <w:rPr>
+          <w:b/>
+          <w:bCs/>
+          <w:i w:val="false"/>
+          <w:iCs w:val="false"/>
+          <w:color w:val="1F4E79"/>
+          <w:sz w:val="24"/>
+          <w:szCs w:val="24"/>
+          <w:rFonts w:ascii="Times New Roman" w:cs="Times New Roman" w:eastAsia="Times New Roman" w:hAnsi="Times New Roman"/>
+        </w:rPr>
+        <w:t xml:space="preserve">sauvegarde</w:t>
+      </w:r>
+      <w:r>
+        <w:rPr>
+          <w:b w:val="false"/>
+          <w:bCs w:val="false"/>
+          <w:i w:val="false"/>
+          <w:iCs w:val="false"/>
+          <w:color w:val="000000"/>
+          <w:sz w:val="24"/>
+          <w:szCs w:val="24"/>
+          <w:rFonts w:ascii="Times New Roman" w:cs="Times New Roman" w:eastAsia="Times New Roman" w:hAnsi="Times New Roman"/>
+        </w:rPr>
+        <w:t xml:space="preserve"> suit une chaîne :</w:t>
+      </w:r>
+    </w:p>
+    <w:p>
+      <w:pPr>
+        <w:spacing w:after="60" w:line="300"/>
+        <w:jc w:val="both"/>
+      </w:pPr>
+      <w:r>
+        <w:rPr>
+          <w:b w:val="false"/>
+          <w:bCs w:val="false"/>
+          <w:i w:val="false"/>
+          <w:iCs w:val="false"/>
+          <w:color w:val="000000"/>
+          <w:sz w:val="24"/>
+          <w:szCs w:val="24"/>
+          <w:rFonts w:ascii="Times New Roman" w:cs="Times New Roman" w:eastAsia="Times New Roman" w:hAnsi="Times New Roman"/>
+        </w:rPr>
+        <w:t xml:space="preserve">• </w:t>
+      </w:r>
+      <w:r>
+        <w:rPr>
+          <w:b/>
+          <w:bCs/>
+          <w:i w:val="false"/>
+          <w:iCs w:val="false"/>
+          <w:color w:val="1F4E79"/>
+          <w:sz w:val="24"/>
+          <w:szCs w:val="24"/>
+          <w:rFonts w:ascii="Times New Roman" w:cs="Times New Roman" w:eastAsia="Times New Roman" w:hAnsi="Times New Roman"/>
+        </w:rPr>
+        <w:t xml:space="preserve">définir</w:t>
+      </w:r>
+      <w:r>
+        <w:rPr>
+          <w:b w:val="false"/>
+          <w:bCs w:val="false"/>
+          <w:i w:val="false"/>
+          <w:iCs w:val="false"/>
+          <w:color w:val="000000"/>
+          <w:sz w:val="24"/>
+          <w:szCs w:val="24"/>
+          <w:rFonts w:ascii="Times New Roman" w:cs="Times New Roman" w:eastAsia="Times New Roman" w:hAnsi="Times New Roman"/>
+        </w:rPr>
+        <w:t xml:space="preserve"> : inventorier ce qui fait patrimoine — c’est le travail des historiens, des musées, des communautés elles-mêmes ;</w:t>
+      </w:r>
+    </w:p>
+    <w:p>
+      <w:pPr>
+        <w:spacing w:after="60" w:line="300"/>
+        <w:jc w:val="both"/>
+      </w:pPr>
+      <w:r>
+        <w:rPr>
+          <w:b w:val="false"/>
+          <w:bCs w:val="false"/>
+          <w:i w:val="false"/>
+          <w:iCs w:val="false"/>
+          <w:color w:val="000000"/>
+          <w:sz w:val="24"/>
+          <w:szCs w:val="24"/>
+          <w:rFonts w:ascii="Times New Roman" w:cs="Times New Roman" w:eastAsia="Times New Roman" w:hAnsi="Times New Roman"/>
+        </w:rPr>
+        <w:t xml:space="preserve">• </w:t>
+      </w:r>
+      <w:r>
+        <w:rPr>
+          <w:b/>
+          <w:bCs/>
+          <w:i w:val="false"/>
+          <w:iCs w:val="false"/>
+          <w:color w:val="1F4E79"/>
+          <w:sz w:val="24"/>
+          <w:szCs w:val="24"/>
+          <w:rFonts w:ascii="Times New Roman" w:cs="Times New Roman" w:eastAsia="Times New Roman" w:hAnsi="Times New Roman"/>
+        </w:rPr>
+        <w:t xml:space="preserve">sensibiliser</w:t>
+      </w:r>
+      <w:r>
+        <w:rPr>
+          <w:b w:val="false"/>
+          <w:bCs w:val="false"/>
+          <w:i w:val="false"/>
+          <w:iCs w:val="false"/>
+          <w:color w:val="000000"/>
+          <w:sz w:val="24"/>
+          <w:szCs w:val="24"/>
+          <w:rFonts w:ascii="Times New Roman" w:cs="Times New Roman" w:eastAsia="Times New Roman" w:hAnsi="Times New Roman"/>
+        </w:rPr>
+        <w:t xml:space="preserve"> : expliquer sa valeur à tous — par l’école, les médias, les journées du patrimoine ; on ne respecte que ce qu’on comprend ;</w:t>
+      </w:r>
+    </w:p>
+    <w:p>
+      <w:pPr>
+        <w:spacing w:after="60" w:line="300"/>
+        <w:jc w:val="both"/>
+      </w:pPr>
+      <w:r>
+        <w:rPr>
+          <w:b w:val="false"/>
+          <w:bCs w:val="false"/>
+          <w:i w:val="false"/>
+          <w:iCs w:val="false"/>
+          <w:color w:val="000000"/>
+          <w:sz w:val="24"/>
+          <w:szCs w:val="24"/>
+          <w:rFonts w:ascii="Times New Roman" w:cs="Times New Roman" w:eastAsia="Times New Roman" w:hAnsi="Times New Roman"/>
+        </w:rPr>
+        <w:t xml:space="preserve">• protéger par la loi : Madagascar s’est doté d’une législation sur la protection du patrimoine national, qui classe les biens culturels, interdit leur destruction, leur </w:t>
+      </w:r>
+      <w:r>
+        <w:rPr>
+          <w:b/>
+          <w:bCs/>
+          <w:i w:val="false"/>
+          <w:iCs w:val="false"/>
+          <w:color w:val="1F4E79"/>
+          <w:sz w:val="24"/>
+          <w:szCs w:val="24"/>
+          <w:rFonts w:ascii="Times New Roman" w:cs="Times New Roman" w:eastAsia="Times New Roman" w:hAnsi="Times New Roman"/>
+        </w:rPr>
+        <w:t xml:space="preserve">pillage</w:t>
+      </w:r>
+      <w:r>
+        <w:rPr>
+          <w:b w:val="false"/>
+          <w:bCs w:val="false"/>
+          <w:i w:val="false"/>
+          <w:iCs w:val="false"/>
+          <w:color w:val="000000"/>
+          <w:sz w:val="24"/>
+          <w:szCs w:val="24"/>
+          <w:rFonts w:ascii="Times New Roman" w:cs="Times New Roman" w:eastAsia="Times New Roman" w:hAnsi="Times New Roman"/>
+        </w:rPr>
+        <w:t xml:space="preserve"> et leur sortie du territoire, et punit les contrevenants ; les conventions de l’UNESCO complètent cette protection au niveau mondial ;</w:t>
+      </w:r>
+    </w:p>
+    <w:p>
+      <w:pPr>
+        <w:spacing w:after="60" w:line="300"/>
+        <w:jc w:val="both"/>
+      </w:pPr>
+      <w:r>
+        <w:rPr>
+          <w:b w:val="false"/>
+          <w:bCs w:val="false"/>
+          <w:i w:val="false"/>
+          <w:iCs w:val="false"/>
+          <w:color w:val="000000"/>
+          <w:sz w:val="24"/>
+          <w:szCs w:val="24"/>
+          <w:rFonts w:ascii="Times New Roman" w:cs="Times New Roman" w:eastAsia="Times New Roman" w:hAnsi="Times New Roman"/>
+        </w:rPr>
+        <w:t xml:space="preserve">• transmettre : le patrimoine immatériel surtout ne survit que par la </w:t>
+      </w:r>
+      <w:r>
+        <w:rPr>
+          <w:b/>
+          <w:bCs/>
+          <w:i w:val="false"/>
+          <w:iCs w:val="false"/>
+          <w:color w:val="1F4E79"/>
+          <w:sz w:val="24"/>
+          <w:szCs w:val="24"/>
+          <w:rFonts w:ascii="Times New Roman" w:cs="Times New Roman" w:eastAsia="Times New Roman" w:hAnsi="Times New Roman"/>
+        </w:rPr>
+        <w:t xml:space="preserve">transmission</w:t>
+      </w:r>
+      <w:r>
+        <w:rPr>
+          <w:b w:val="false"/>
+          <w:bCs w:val="false"/>
+          <w:i w:val="false"/>
+          <w:iCs w:val="false"/>
+          <w:color w:val="000000"/>
+          <w:sz w:val="24"/>
+          <w:szCs w:val="24"/>
+          <w:rFonts w:ascii="Times New Roman" w:cs="Times New Roman" w:eastAsia="Times New Roman" w:hAnsi="Times New Roman"/>
+        </w:rPr>
+        <w:t xml:space="preserve"> — les coutumes, les contes, les danses, les traditions culinaires, les savoir-faire doivent passer des anciens aux jeunes : c’est l’affaire des familles, des associations, de l’école… et la tienne ;</w:t>
+      </w:r>
+    </w:p>
+    <w:p>
+      <w:pPr>
+        <w:spacing w:after="60" w:line="300"/>
+        <w:jc w:val="both"/>
+      </w:pPr>
+      <w:r>
+        <w:rPr>
+          <w:b w:val="false"/>
+          <w:bCs w:val="false"/>
+          <w:i w:val="false"/>
+          <w:iCs w:val="false"/>
+          <w:color w:val="000000"/>
+          <w:sz w:val="24"/>
+          <w:szCs w:val="24"/>
+          <w:rFonts w:ascii="Times New Roman" w:cs="Times New Roman" w:eastAsia="Times New Roman" w:hAnsi="Times New Roman"/>
+        </w:rPr>
+        <w:t xml:space="preserve">• entretenir la </w:t>
+      </w:r>
+      <w:r>
+        <w:rPr>
+          <w:b/>
+          <w:bCs/>
+          <w:i w:val="false"/>
+          <w:iCs w:val="false"/>
+          <w:color w:val="1F4E79"/>
+          <w:sz w:val="24"/>
+          <w:szCs w:val="24"/>
+          <w:rFonts w:ascii="Times New Roman" w:cs="Times New Roman" w:eastAsia="Times New Roman" w:hAnsi="Times New Roman"/>
+        </w:rPr>
+        <w:t xml:space="preserve">mémoire collective</w:t>
+      </w:r>
+      <w:r>
+        <w:rPr>
+          <w:b w:val="false"/>
+          <w:bCs w:val="false"/>
+          <w:i w:val="false"/>
+          <w:iCs w:val="false"/>
+          <w:color w:val="000000"/>
+          <w:sz w:val="24"/>
+          <w:szCs w:val="24"/>
+          <w:rFonts w:ascii="Times New Roman" w:cs="Times New Roman" w:eastAsia="Times New Roman" w:hAnsi="Times New Roman"/>
+        </w:rPr>
+        <w:t xml:space="preserve"> : </w:t>
+      </w:r>
+      <w:r>
+        <w:rPr>
+          <w:b/>
+          <w:bCs/>
+          <w:i w:val="false"/>
+          <w:iCs w:val="false"/>
+          <w:color w:val="1F4E79"/>
+          <w:sz w:val="24"/>
+          <w:szCs w:val="24"/>
+          <w:rFonts w:ascii="Times New Roman" w:cs="Times New Roman" w:eastAsia="Times New Roman" w:hAnsi="Times New Roman"/>
+        </w:rPr>
+        <w:t xml:space="preserve">commémoration</w:t>
+      </w:r>
+      <w:r>
+        <w:rPr>
+          <w:b w:val="false"/>
+          <w:bCs w:val="false"/>
+          <w:i w:val="false"/>
+          <w:iCs w:val="false"/>
+          <w:color w:val="000000"/>
+          <w:sz w:val="24"/>
+          <w:szCs w:val="24"/>
+          <w:rFonts w:ascii="Times New Roman" w:cs="Times New Roman" w:eastAsia="Times New Roman" w:hAnsi="Times New Roman"/>
+        </w:rPr>
+        <w:t xml:space="preserve">s, musées, enseignement de l’Histoire — ce manuel lui-même y participe.</w:t>
+      </w:r>
+    </w:p>
+    <w:p>
+      <w:pPr>
+        <w:spacing w:after="80" w:line="300"/>
+        <w:jc w:val="both"/>
+      </w:pPr>
+      <w:r>
+        <w:rPr>
+          <w:b/>
+          <w:bCs/>
+          <w:i w:val="false"/>
+          <w:iCs w:val="false"/>
+          <w:color w:val="2E7D32"/>
+          <w:sz w:val="26"/>
+          <w:szCs w:val="26"/>
+          <w:rFonts w:ascii="Times New Roman" w:cs="Times New Roman" w:eastAsia="Times New Roman" w:hAnsi="Times New Roman"/>
+        </w:rPr>
+        <w:t xml:space="preserve">3. La boucle de l’année se referme</w:t>
+      </w:r>
+    </w:p>
+    <w:p>
+      <w:pPr>
+        <w:spacing w:after="100" w:line="300"/>
+        <w:jc w:val="both"/>
+      </w:pPr>
+      <w:r>
+        <w:rPr>
+          <w:b w:val="false"/>
+          <w:bCs w:val="false"/>
+          <w:i w:val="false"/>
+          <w:iCs w:val="false"/>
+          <w:color w:val="000000"/>
+          <w:sz w:val="24"/>
+          <w:szCs w:val="24"/>
+          <w:rFonts w:ascii="Times New Roman" w:cs="Times New Roman" w:eastAsia="Times New Roman" w:hAnsi="Times New Roman"/>
+        </w:rPr>
+        <w:t xml:space="preserve">À l’unité I, tu as appris à recueillir la mémoire des anciens ; tu sais maintenant pourquoi ce geste est vital — chaque enquête orale, chaque conte noté, chaque visite d’un site est un acte de </w:t>
+      </w:r>
+      <w:r>
+        <w:rPr>
+          <w:b/>
+          <w:bCs/>
+          <w:i w:val="false"/>
+          <w:iCs w:val="false"/>
+          <w:color w:val="1F4E79"/>
+          <w:sz w:val="24"/>
+          <w:szCs w:val="24"/>
+          <w:rFonts w:ascii="Times New Roman" w:cs="Times New Roman" w:eastAsia="Times New Roman" w:hAnsi="Times New Roman"/>
+        </w:rPr>
+        <w:t xml:space="preserve">sauvegarde</w:t>
+      </w:r>
+      <w:r>
+        <w:rPr>
+          <w:b w:val="false"/>
+          <w:bCs w:val="false"/>
+          <w:i w:val="false"/>
+          <w:iCs w:val="false"/>
+          <w:color w:val="000000"/>
+          <w:sz w:val="24"/>
+          <w:szCs w:val="24"/>
+          <w:rFonts w:ascii="Times New Roman" w:cs="Times New Roman" w:eastAsia="Times New Roman" w:hAnsi="Times New Roman"/>
+        </w:rPr>
+        <w:t xml:space="preserve">. Le patrimoine n’a pas de meilleurs gardiens que ceux qui l’aiment et le connaissent : vous.</w:t>
       </w:r>
     </w:p>
     <w:p>
@@ -5764,8 +7421,331 @@
     </w:p>
     <w:p>
       <w:pPr>
-        <w:spacing w:before="200" w:after="150"/>
-        <w:jc w:val="left"/>
+        <w:spacing w:after="120"/>
+      </w:pPr>
+    </w:p>
+    <w:tbl>
+      <w:tblPr>
+        <w:tblW w:type="dxa" w:w="9600"/>
+        <w:tblBorders>
+          <w:top w:val="single" w:color="B25000" w:sz="12"/>
+          <w:left w:val="single" w:color="B25000" w:sz="12"/>
+          <w:bottom w:val="single" w:color="B25000" w:sz="12"/>
+          <w:right w:val="single" w:color="B25000" w:sz="12"/>
+          <w:insideH w:val="none"/>
+          <w:insideV w:val="none"/>
+        </w:tblBorders>
+        <w:tblLayout w:type="fixed"/>
+      </w:tblPr>
+      <w:tblGrid>
+        <w:gridCol w:w="9600"/>
+      </w:tblGrid>
+      <w:tr>
+        <w:tc>
+          <w:tcPr>
+            <w:shd w:fill="FFF8EF" w:val="clear"/>
+            <w:tcMar>
+              <w:top w:type="dxa" w:w="140"/>
+              <w:left w:type="dxa" w:w="180"/>
+              <w:bottom w:type="dxa" w:w="140"/>
+              <w:right w:type="dxa" w:w="180"/>
+            </w:tcMar>
+          </w:tcPr>
+          <w:p>
+            <w:pPr>
+              <w:spacing w:after="90"/>
+            </w:pPr>
+            <w:r>
+              <w:rPr>
+                <w:b/>
+                <w:bCs/>
+                <w:i w:val="false"/>
+                <w:iCs w:val="false"/>
+                <w:color w:val="B25000"/>
+                <w:sz w:val="25"/>
+                <w:szCs w:val="25"/>
+                <w:rFonts w:ascii="Times New Roman" w:cs="Times New Roman" w:eastAsia="Times New Roman" w:hAnsi="Times New Roman"/>
+              </w:rPr>
+              <w:t xml:space="preserve">Document à étudier</w:t>
+            </w:r>
+          </w:p>
+          <w:p>
+            <w:pPr>
+              <w:spacing w:after="80" w:line="300"/>
+              <w:jc w:val="left"/>
+            </w:pPr>
+            <w:r>
+              <w:rPr>
+                <w:b/>
+                <w:bCs/>
+                <w:i w:val="false"/>
+                <w:iCs w:val="false"/>
+                <w:color w:val="000000"/>
+                <w:sz w:val="21"/>
+                <w:szCs w:val="21"/>
+                <w:rFonts w:ascii="Times New Roman" w:cs="Times New Roman" w:eastAsia="Times New Roman" w:hAnsi="Times New Roman"/>
+              </w:rPr>
+              <w:t xml:space="preserve">La loi malgache protège le patrimoine national — d’après l’ordonnance n° 82-029 relative à la sauvegarde, la protection et la conservation du patrimoine national (Madagascar, 1982) — extraits adaptés</w:t>
+            </w:r>
+          </w:p>
+          <w:p>
+            <w:pPr>
+              <w:spacing w:after="100" w:line="300"/>
+              <w:jc w:val="both"/>
+            </w:pPr>
+            <w:r>
+              <w:rPr>
+                <w:b w:val="false"/>
+                <w:bCs w:val="false"/>
+                <w:i/>
+                <w:iCs/>
+                <w:color w:val="000000"/>
+                <w:sz w:val="24"/>
+                <w:szCs w:val="24"/>
+                <w:rFonts w:ascii="Times New Roman" w:cs="Times New Roman" w:eastAsia="Times New Roman" w:hAnsi="Times New Roman"/>
+              </w:rPr>
+              <w:t xml:space="preserve">« Le patrimoine national comprend les biens culturels, meubles et immeubles, qui présentent un intérêt pour l’histoire, l’art, l’archéologie ou les traditions du pays. Les biens classés ne peuvent être détruits, déplacés, modifiés ou restaurés sans autorisation. L’exportation des biens culturels classés hors du territoire national est interdite. Les fouilles archéologiques sont soumises à autorisation, et toute découverte fortuite doit être déclarée à l’autorité compétente. Les infractions aux présentes dispositions sont punies conformément à la loi. »</w:t>
+            </w:r>
+          </w:p>
+          <w:p>
+            <w:pPr>
+              <w:spacing w:after="40" w:line="300"/>
+              <w:jc w:val="both"/>
+            </w:pPr>
+            <w:r>
+              <w:rPr>
+                <w:b w:val="false"/>
+                <w:bCs w:val="false"/>
+                <w:i w:val="false"/>
+                <w:iCs w:val="false"/>
+                <w:color w:val="000000"/>
+                <w:sz w:val="24"/>
+                <w:szCs w:val="24"/>
+                <w:rFonts w:ascii="Times New Roman" w:cs="Times New Roman" w:eastAsia="Times New Roman" w:hAnsi="Times New Roman"/>
+              </w:rPr>
+              <w:t xml:space="preserve">1. Quels biens la loi protège-t-elle, et contre quels dangers ?</w:t>
+            </w:r>
+          </w:p>
+          <w:p>
+            <w:pPr>
+              <w:spacing w:after="40" w:line="300"/>
+              <w:jc w:val="both"/>
+            </w:pPr>
+            <w:r>
+              <w:rPr>
+                <w:b w:val="false"/>
+                <w:bCs w:val="false"/>
+                <w:i w:val="false"/>
+                <w:iCs w:val="false"/>
+                <w:color w:val="000000"/>
+                <w:sz w:val="24"/>
+                <w:szCs w:val="24"/>
+                <w:rFonts w:ascii="Times New Roman" w:cs="Times New Roman" w:eastAsia="Times New Roman" w:hAnsi="Times New Roman"/>
+              </w:rPr>
+              <w:t xml:space="preserve">2. Pourquoi interdire l’exportation des biens culturels classés ?</w:t>
+            </w:r>
+          </w:p>
+          <w:p>
+            <w:pPr>
+              <w:spacing w:after="40" w:line="300"/>
+              <w:jc w:val="both"/>
+            </w:pPr>
+            <w:r>
+              <w:rPr>
+                <w:b w:val="false"/>
+                <w:bCs w:val="false"/>
+                <w:i w:val="false"/>
+                <w:iCs w:val="false"/>
+                <w:color w:val="000000"/>
+                <w:sz w:val="24"/>
+                <w:szCs w:val="24"/>
+                <w:rFonts w:ascii="Times New Roman" w:cs="Times New Roman" w:eastAsia="Times New Roman" w:hAnsi="Times New Roman"/>
+              </w:rPr>
+              <w:t xml:space="preserve">3. Que doit faire un paysan qui découvre des poteries anciennes dans son champ ? Pourquoi ?</w:t>
+            </w:r>
+          </w:p>
+          <w:p>
+            <w:pPr>
+              <w:spacing w:after="60"/>
+            </w:pPr>
+          </w:p>
+          <w:p>
+            <w:pPr>
+              <w:spacing w:after="40"/>
+            </w:pPr>
+            <w:r>
+              <w:rPr>
+                <w:b/>
+                <w:bCs/>
+                <w:i w:val="false"/>
+                <w:iCs w:val="false"/>
+                <w:color w:val="C2185B"/>
+                <w:sz w:val="22"/>
+                <w:szCs w:val="22"/>
+                <w:rFonts w:ascii="Times New Roman" w:cs="Times New Roman" w:eastAsia="Times New Roman" w:hAnsi="Times New Roman"/>
+              </w:rPr>
+              <w:t xml:space="preserve">Réponse 1. </w:t>
+            </w:r>
+            <w:r>
+              <w:rPr>
+                <w:b w:val="false"/>
+                <w:bCs w:val="false"/>
+                <w:i w:val="false"/>
+                <w:iCs w:val="false"/>
+                <w:color w:val="000000"/>
+                <w:sz w:val="22"/>
+                <w:szCs w:val="22"/>
+                <w:rFonts w:ascii="Times New Roman" w:cs="Times New Roman" w:eastAsia="Times New Roman" w:hAnsi="Times New Roman"/>
+              </w:rPr>
+              <w:t xml:space="preserve">Les biens culturels d’intérêt historique, artistique, archéologique ou traditionnel — contre la destruction, le déplacement, la modification sauvage, l’exportation et le pillage des fouilles.</w:t>
+            </w:r>
+          </w:p>
+          <w:p>
+            <w:pPr>
+              <w:spacing w:after="40"/>
+            </w:pPr>
+            <w:r>
+              <w:rPr>
+                <w:b/>
+                <w:bCs/>
+                <w:i w:val="false"/>
+                <w:iCs w:val="false"/>
+                <w:color w:val="C2185B"/>
+                <w:sz w:val="22"/>
+                <w:szCs w:val="22"/>
+                <w:rFonts w:ascii="Times New Roman" w:cs="Times New Roman" w:eastAsia="Times New Roman" w:hAnsi="Times New Roman"/>
+              </w:rPr>
+              <w:t xml:space="preserve">Réponse 2. </w:t>
+            </w:r>
+            <w:r>
+              <w:rPr>
+                <w:b w:val="false"/>
+                <w:bCs w:val="false"/>
+                <w:i w:val="false"/>
+                <w:iCs w:val="false"/>
+                <w:color w:val="000000"/>
+                <w:sz w:val="22"/>
+                <w:szCs w:val="22"/>
+                <w:rFonts w:ascii="Times New Roman" w:cs="Times New Roman" w:eastAsia="Times New Roman" w:hAnsi="Times New Roman"/>
+              </w:rPr>
+              <w:t xml:space="preserve">Parce qu’un bien sorti du territoire est perdu pour la mémoire nationale : il enrichit des collections lointaines au lieu de raconter l’histoire du pays à ses propres enfants.</w:t>
+            </w:r>
+          </w:p>
+          <w:p>
+            <w:pPr>
+              <w:spacing w:after="40"/>
+            </w:pPr>
+            <w:r>
+              <w:rPr>
+                <w:b/>
+                <w:bCs/>
+                <w:i w:val="false"/>
+                <w:iCs w:val="false"/>
+                <w:color w:val="C2185B"/>
+                <w:sz w:val="22"/>
+                <w:szCs w:val="22"/>
+                <w:rFonts w:ascii="Times New Roman" w:cs="Times New Roman" w:eastAsia="Times New Roman" w:hAnsi="Times New Roman"/>
+              </w:rPr>
+              <w:t xml:space="preserve">Réponse 3. </w:t>
+            </w:r>
+            <w:r>
+              <w:rPr>
+                <w:b w:val="false"/>
+                <w:bCs w:val="false"/>
+                <w:i w:val="false"/>
+                <w:iCs w:val="false"/>
+                <w:color w:val="000000"/>
+                <w:sz w:val="22"/>
+                <w:szCs w:val="22"/>
+                <w:rFonts w:ascii="Times New Roman" w:cs="Times New Roman" w:eastAsia="Times New Roman" w:hAnsi="Times New Roman"/>
+              </w:rPr>
+              <w:t xml:space="preserve">Déclarer sa découverte à l’autorité compétente : une poterie arrachée sans méthode perd son contexte — datée et étudiée en place, elle devient une page d’histoire (souviens-toi de la démarche archéologique).</w:t>
+            </w:r>
+          </w:p>
+        </w:tc>
+      </w:tr>
+    </w:tbl>
+    <w:p>
+      <w:pPr>
+        <w:spacing w:after="160"/>
+      </w:pPr>
+    </w:p>
+    <w:tbl>
+      <w:tblPr>
+        <w:tblW w:type="dxa" w:w="9600"/>
+        <w:tblBorders>
+          <w:top w:val="single" w:color="1565C0" w:sz="12"/>
+          <w:left w:val="single" w:color="1565C0" w:sz="12"/>
+          <w:bottom w:val="single" w:color="1565C0" w:sz="12"/>
+          <w:right w:val="single" w:color="1565C0" w:sz="12"/>
+          <w:insideH w:val="none"/>
+          <w:insideV w:val="none"/>
+        </w:tblBorders>
+        <w:tblLayout w:type="fixed"/>
+      </w:tblPr>
+      <w:tblGrid>
+        <w:gridCol w:w="9600"/>
+      </w:tblGrid>
+      <w:tr>
+        <w:tc>
+          <w:tcPr>
+            <w:shd w:fill="E3F2FD" w:val="clear"/>
+            <w:tcMar>
+              <w:top w:type="dxa" w:w="140"/>
+              <w:left w:type="dxa" w:w="180"/>
+              <w:bottom w:type="dxa" w:w="140"/>
+              <w:right w:type="dxa" w:w="180"/>
+            </w:tcMar>
+          </w:tcPr>
+          <w:p>
+            <w:pPr>
+              <w:spacing w:after="90"/>
+            </w:pPr>
+            <w:r>
+              <w:rPr>
+                <w:b/>
+                <w:bCs/>
+                <w:i w:val="false"/>
+                <w:iCs w:val="false"/>
+                <w:color w:val="1565C0"/>
+                <w:sz w:val="25"/>
+                <w:szCs w:val="25"/>
+                <w:rFonts w:ascii="Times New Roman" w:cs="Times New Roman" w:eastAsia="Times New Roman" w:hAnsi="Times New Roman"/>
+              </w:rPr>
+              <w:t xml:space="preserve">Le savais-tu ?</w:t>
+            </w:r>
+          </w:p>
+          <w:p>
+            <w:pPr>
+              <w:spacing w:after="0" w:line="300"/>
+              <w:jc w:val="both"/>
+            </w:pPr>
+            <w:r>
+              <w:rPr>
+                <w:b w:val="false"/>
+                <w:bCs w:val="false"/>
+                <w:i w:val="false"/>
+                <w:iCs w:val="false"/>
+                <w:color w:val="000000"/>
+                <w:sz w:val="22"/>
+                <w:szCs w:val="22"/>
+                <w:rFonts w:ascii="Times New Roman" w:cs="Times New Roman" w:eastAsia="Times New Roman" w:hAnsi="Times New Roman"/>
+              </w:rPr>
+              <w:t xml:space="preserve">Après l’incendie de 1995, le Rova d’Antananarivo a été patiemment reconstruit — des années de travaux pour rendre à la capitale son symbole. Mais le plus émouvant est ailleurs : une partie des objets royaux avait été sauvée des flammes par des mains anonymes, gardée puis restituée. La meilleure assurance d’un patrimoine, ce sont les citoyens qui le considèrent comme leur bien propre.</w:t>
+            </w:r>
+          </w:p>
+        </w:tc>
+      </w:tr>
+    </w:tbl>
+    <w:p>
+      <w:pPr>
+        <w:spacing w:after="160"/>
+      </w:pPr>
+    </w:p>
+    <w:p>
+      <w:pPr>
+        <w:spacing w:after="80" w:line="300"/>
+        <w:jc w:val="both"/>
       </w:pPr>
       <w:r>
         <w:rPr>
@@ -5774,166 +7754,337 @@
           <w:i w:val="false"/>
           <w:iCs w:val="false"/>
           <w:color w:val="2E7D32"/>
-          <w:sz w:val="28"/>
-          <w:szCs w:val="28"/>
-          <w:rFonts w:ascii="Times New Roman" w:cs="Times New Roman" w:eastAsia="Times New Roman" w:hAnsi="Times New Roman"/>
-        </w:rPr>
-        <w:t xml:space="preserve">Méthode</w:t>
-      </w:r>
-    </w:p>
-    <w:p>
-      <w:pPr>
-        <w:spacing w:after="60" w:line="300"/>
-        <w:jc w:val="both"/>
-      </w:pPr>
-      <w:r>
-        <w:rPr>
-          <w:b w:val="false"/>
-          <w:bCs w:val="false"/>
-          <w:i w:val="false"/>
-          <w:iCs w:val="false"/>
-          <w:color w:val="000000"/>
-          <w:sz w:val="24"/>
-          <w:szCs w:val="24"/>
-          <w:rFonts w:ascii="Times New Roman" w:cs="Times New Roman" w:eastAsia="Times New Roman" w:hAnsi="Times New Roman"/>
-        </w:rPr>
-        <w:t xml:space="preserve">1. Justifier la protection : mémoire collective, caractère irremplaçable, richesse d’avenir.</w:t>
-      </w:r>
-    </w:p>
-    <w:p>
-      <w:pPr>
-        <w:spacing w:after="60" w:line="300"/>
-        <w:jc w:val="both"/>
-      </w:pPr>
-      <w:r>
-        <w:rPr>
-          <w:b w:val="false"/>
-          <w:bCs w:val="false"/>
-          <w:i w:val="false"/>
-          <w:iCs w:val="false"/>
-          <w:color w:val="000000"/>
-          <w:sz w:val="24"/>
-          <w:szCs w:val="24"/>
-          <w:rFonts w:ascii="Times New Roman" w:cs="Times New Roman" w:eastAsia="Times New Roman" w:hAnsi="Times New Roman"/>
-        </w:rPr>
-        <w:t xml:space="preserve">2. Réciter la chaîne de sauvegarde en cinq maillons.</w:t>
-      </w:r>
-    </w:p>
-    <w:p>
-      <w:pPr>
-        <w:spacing w:after="60" w:line="300"/>
-        <w:jc w:val="both"/>
-      </w:pPr>
-      <w:r>
-        <w:rPr>
-          <w:b w:val="false"/>
-          <w:bCs w:val="false"/>
-          <w:i w:val="false"/>
-          <w:iCs w:val="false"/>
-          <w:color w:val="000000"/>
-          <w:sz w:val="24"/>
-          <w:szCs w:val="24"/>
-          <w:rFonts w:ascii="Times New Roman" w:cs="Times New Roman" w:eastAsia="Times New Roman" w:hAnsi="Times New Roman"/>
-        </w:rPr>
-        <w:t xml:space="preserve">3. Citer le rôle de la loi de protection et celui de la transmission.</w:t>
-      </w:r>
-    </w:p>
-    <w:p>
-      <w:pPr>
-        <w:spacing w:after="110" w:line="300"/>
-        <w:jc w:val="both"/>
-      </w:pPr>
-      <w:r>
-        <w:rPr>
-          <w:b/>
-          <w:bCs/>
-          <w:i w:val="false"/>
-          <w:iCs w:val="false"/>
-          <w:color w:val="1F4E79"/>
-          <w:sz w:val="24"/>
-          <w:szCs w:val="24"/>
-          <w:rFonts w:ascii="Times New Roman" w:cs="Times New Roman" w:eastAsia="Times New Roman" w:hAnsi="Times New Roman"/>
-        </w:rPr>
-        <w:t xml:space="preserve">Exemple — </w:t>
-      </w:r>
-      <w:r>
-        <w:rPr>
-          <w:b w:val="false"/>
-          <w:bCs w:val="false"/>
-          <w:i w:val="false"/>
-          <w:iCs w:val="false"/>
-          <w:color w:val="000000"/>
-          <w:sz w:val="24"/>
-          <w:szCs w:val="24"/>
-          <w:rFonts w:ascii="Times New Roman" w:cs="Times New Roman" w:eastAsia="Times New Roman" w:hAnsi="Times New Roman"/>
-        </w:rPr>
-        <w:t xml:space="preserve">Un projet de classe complet : inventorier les sites et traditions du fokontany (définir), monter une exposition à l’école (sensibiliser), alerter le fokontany sur une tombe ancienne menacée (protéger), enregistrer les contes d’une grand-mère (transmettre) — une enquête orale devenue acte de sauvegarde.</w:t>
-      </w:r>
-    </w:p>
-    <w:p>
-      <w:pPr>
-        <w:spacing w:after="110" w:line="300"/>
-        <w:jc w:val="both"/>
-      </w:pPr>
-      <w:r>
-        <w:rPr>
-          <w:b/>
-          <w:bCs/>
-          <w:i w:val="false"/>
-          <w:iCs w:val="false"/>
-          <w:color w:val="B25000"/>
-          <w:sz w:val="24"/>
-          <w:szCs w:val="24"/>
-          <w:rFonts w:ascii="Times New Roman" w:cs="Times New Roman" w:eastAsia="Times New Roman" w:hAnsi="Times New Roman"/>
-        </w:rPr>
-        <w:t xml:space="preserve">Erreur à éviter — </w:t>
-      </w:r>
-      <w:r>
-        <w:rPr>
-          <w:b w:val="false"/>
-          <w:bCs w:val="false"/>
-          <w:i w:val="false"/>
-          <w:iCs w:val="false"/>
-          <w:color w:val="000000"/>
-          <w:sz w:val="24"/>
-          <w:szCs w:val="24"/>
-          <w:rFonts w:ascii="Times New Roman" w:cs="Times New Roman" w:eastAsia="Times New Roman" w:hAnsi="Times New Roman"/>
-        </w:rPr>
-        <w:t xml:space="preserve">Penser que la protection du patrimoine est « l’affaire de l’État » seulement : la loi ne peut rien sans les communautés. C’est le villageois qui signale le pillage, la famille qui transmet le conte, l’élève qui interroge les anciens. L’État protège par la loi ; la nation protège par la transmission.</w:t>
-      </w:r>
-    </w:p>
-    <w:p>
-      <w:pPr>
-        <w:shd w:fill="E3F2FD" w:val="clear"/>
-        <w:spacing w:after="110" w:line="300"/>
-        <w:jc w:val="both"/>
-      </w:pPr>
-      <w:r>
-        <w:rPr>
-          <w:b/>
-          <w:bCs/>
-          <w:i w:val="false"/>
-          <w:iCs w:val="false"/>
-          <w:color w:val="1565C0"/>
-          <w:sz w:val="24"/>
-          <w:szCs w:val="24"/>
-          <w:rFonts w:ascii="Times New Roman" w:cs="Times New Roman" w:eastAsia="Times New Roman" w:hAnsi="Times New Roman"/>
-        </w:rPr>
-        <w:t xml:space="preserve">Le savais-tu ? </w:t>
-      </w:r>
-      <w:r>
-        <w:rPr>
-          <w:b w:val="false"/>
-          <w:bCs w:val="false"/>
-          <w:i w:val="false"/>
-          <w:iCs w:val="false"/>
-          <w:color w:val="000000"/>
-          <w:sz w:val="24"/>
-          <w:szCs w:val="24"/>
-          <w:rFonts w:ascii="Times New Roman" w:cs="Times New Roman" w:eastAsia="Times New Roman" w:hAnsi="Times New Roman"/>
-        </w:rPr>
-        <w:t xml:space="preserve">Après l’incendie de 1995, le Rova d’Antananarivo a été patiemment reconstruit — des années de travaux pour rendre à la capitale son symbole. Mais le plus émouvant est ailleurs : une partie des objets royaux avait été sauvée des flammes par des mains anonymes, gardée puis restituée. La meilleure assurance d’un patrimoine, ce sont les citoyens qui le considèrent comme leur bien propre.</w:t>
-      </w:r>
+          <w:sz w:val="26"/>
+          <w:szCs w:val="26"/>
+          <w:rFonts w:ascii="Times New Roman" w:cs="Times New Roman" w:eastAsia="Times New Roman" w:hAnsi="Times New Roman"/>
+        </w:rPr>
+        <w:t xml:space="preserve">Petit lexique</w:t>
+      </w:r>
+    </w:p>
+    <w:tbl>
+      <w:tblPr>
+        <w:tblW w:type="dxa" w:w="9600"/>
+        <w:tblBorders>
+          <w:top w:val="single" w:color="808080" w:sz="4"/>
+          <w:left w:val="single" w:color="808080" w:sz="4"/>
+          <w:bottom w:val="single" w:color="808080" w:sz="4"/>
+          <w:right w:val="single" w:color="808080" w:sz="4"/>
+          <w:insideH w:val="single" w:color="B0B0B0" w:sz="4"/>
+          <w:insideV w:val="single" w:color="B0B0B0" w:sz="4"/>
+        </w:tblBorders>
+        <w:tblLayout w:type="fixed"/>
+      </w:tblPr>
+      <w:tblGrid>
+        <w:gridCol w:w="2800"/>
+        <w:gridCol w:w="6800"/>
+      </w:tblGrid>
+      <w:tr>
+        <w:tc>
+          <w:tcPr>
+            <w:shd w:fill="E7E6E6" w:val="clear"/>
+            <w:tcMar>
+              <w:top w:type="dxa" w:w="80"/>
+              <w:left w:type="dxa" w:w="80"/>
+              <w:bottom w:type="dxa" w:w="80"/>
+              <w:right w:type="dxa" w:w="80"/>
+            </w:tcMar>
+          </w:tcPr>
+          <w:p>
+            <w:pPr>
+              <w:spacing w:after="40"/>
+              <w:jc w:val="left"/>
+            </w:pPr>
+            <w:r>
+              <w:rPr>
+                <w:b/>
+                <w:bCs/>
+                <w:i w:val="false"/>
+                <w:iCs w:val="false"/>
+                <w:color w:val="000000"/>
+                <w:sz w:val="20"/>
+                <w:szCs w:val="20"/>
+                <w:rFonts w:ascii="Times New Roman" w:cs="Times New Roman" w:eastAsia="Times New Roman" w:hAnsi="Times New Roman"/>
+              </w:rPr>
+              <w:t xml:space="preserve">Mot</w:t>
+            </w:r>
+          </w:p>
+        </w:tc>
+        <w:tc>
+          <w:tcPr>
+            <w:shd w:fill="E7E6E6" w:val="clear"/>
+            <w:tcMar>
+              <w:top w:type="dxa" w:w="80"/>
+              <w:left w:type="dxa" w:w="80"/>
+              <w:bottom w:type="dxa" w:w="80"/>
+              <w:right w:type="dxa" w:w="80"/>
+            </w:tcMar>
+          </w:tcPr>
+          <w:p>
+            <w:pPr>
+              <w:spacing w:after="40"/>
+              <w:jc w:val="left"/>
+            </w:pPr>
+            <w:r>
+              <w:rPr>
+                <w:b/>
+                <w:bCs/>
+                <w:i w:val="false"/>
+                <w:iCs w:val="false"/>
+                <w:color w:val="000000"/>
+                <w:sz w:val="20"/>
+                <w:szCs w:val="20"/>
+                <w:rFonts w:ascii="Times New Roman" w:cs="Times New Roman" w:eastAsia="Times New Roman" w:hAnsi="Times New Roman"/>
+              </w:rPr>
+              <w:t xml:space="preserve">Sens</w:t>
+            </w:r>
+          </w:p>
+        </w:tc>
+      </w:tr>
+      <w:tr>
+        <w:tc>
+          <w:tcPr>
+            <w:tcMar>
+              <w:top w:type="dxa" w:w="80"/>
+              <w:left w:type="dxa" w:w="80"/>
+              <w:bottom w:type="dxa" w:w="80"/>
+              <w:right w:type="dxa" w:w="80"/>
+            </w:tcMar>
+          </w:tcPr>
+          <w:p>
+            <w:pPr>
+              <w:spacing w:after="40"/>
+              <w:jc w:val="left"/>
+            </w:pPr>
+            <w:r>
+              <w:rPr>
+                <w:b/>
+                <w:bCs/>
+                <w:i w:val="false"/>
+                <w:iCs w:val="false"/>
+                <w:color w:val="000000"/>
+                <w:sz w:val="20"/>
+                <w:szCs w:val="20"/>
+                <w:rFonts w:ascii="Times New Roman" w:cs="Times New Roman" w:eastAsia="Times New Roman" w:hAnsi="Times New Roman"/>
+              </w:rPr>
+              <w:t xml:space="preserve">Mémoire collective</w:t>
+            </w:r>
+          </w:p>
+        </w:tc>
+        <w:tc>
+          <w:tcPr>
+            <w:tcMar>
+              <w:top w:type="dxa" w:w="80"/>
+              <w:left w:type="dxa" w:w="80"/>
+              <w:bottom w:type="dxa" w:w="80"/>
+              <w:right w:type="dxa" w:w="80"/>
+            </w:tcMar>
+          </w:tcPr>
+          <w:p>
+            <w:pPr>
+              <w:spacing w:after="40"/>
+              <w:jc w:val="left"/>
+            </w:pPr>
+            <w:r>
+              <w:rPr>
+                <w:b w:val="false"/>
+                <w:bCs w:val="false"/>
+                <w:i w:val="false"/>
+                <w:iCs w:val="false"/>
+                <w:color w:val="000000"/>
+                <w:sz w:val="20"/>
+                <w:szCs w:val="20"/>
+                <w:rFonts w:ascii="Times New Roman" w:cs="Times New Roman" w:eastAsia="Times New Roman" w:hAnsi="Times New Roman"/>
+              </w:rPr>
+              <w:t xml:space="preserve">souvenir commun qui fonde l’identité d’une nation</w:t>
+            </w:r>
+          </w:p>
+        </w:tc>
+      </w:tr>
+      <w:tr>
+        <w:tc>
+          <w:tcPr>
+            <w:tcMar>
+              <w:top w:type="dxa" w:w="80"/>
+              <w:left w:type="dxa" w:w="80"/>
+              <w:bottom w:type="dxa" w:w="80"/>
+              <w:right w:type="dxa" w:w="80"/>
+            </w:tcMar>
+          </w:tcPr>
+          <w:p>
+            <w:pPr>
+              <w:spacing w:after="40"/>
+              <w:jc w:val="left"/>
+            </w:pPr>
+            <w:r>
+              <w:rPr>
+                <w:b/>
+                <w:bCs/>
+                <w:i w:val="false"/>
+                <w:iCs w:val="false"/>
+                <w:color w:val="000000"/>
+                <w:sz w:val="20"/>
+                <w:szCs w:val="20"/>
+                <w:rFonts w:ascii="Times New Roman" w:cs="Times New Roman" w:eastAsia="Times New Roman" w:hAnsi="Times New Roman"/>
+              </w:rPr>
+              <w:t xml:space="preserve">Classement</w:t>
+            </w:r>
+          </w:p>
+        </w:tc>
+        <w:tc>
+          <w:tcPr>
+            <w:tcMar>
+              <w:top w:type="dxa" w:w="80"/>
+              <w:left w:type="dxa" w:w="80"/>
+              <w:bottom w:type="dxa" w:w="80"/>
+              <w:right w:type="dxa" w:w="80"/>
+            </w:tcMar>
+          </w:tcPr>
+          <w:p>
+            <w:pPr>
+              <w:spacing w:after="40"/>
+              <w:jc w:val="left"/>
+            </w:pPr>
+            <w:r>
+              <w:rPr>
+                <w:b w:val="false"/>
+                <w:bCs w:val="false"/>
+                <w:i w:val="false"/>
+                <w:iCs w:val="false"/>
+                <w:color w:val="000000"/>
+                <w:sz w:val="20"/>
+                <w:szCs w:val="20"/>
+                <w:rFonts w:ascii="Times New Roman" w:cs="Times New Roman" w:eastAsia="Times New Roman" w:hAnsi="Times New Roman"/>
+              </w:rPr>
+              <w:t xml:space="preserve">inscription officielle d’un bien sur la liste protégée</w:t>
+            </w:r>
+          </w:p>
+        </w:tc>
+      </w:tr>
+      <w:tr>
+        <w:tc>
+          <w:tcPr>
+            <w:tcMar>
+              <w:top w:type="dxa" w:w="80"/>
+              <w:left w:type="dxa" w:w="80"/>
+              <w:bottom w:type="dxa" w:w="80"/>
+              <w:right w:type="dxa" w:w="80"/>
+            </w:tcMar>
+          </w:tcPr>
+          <w:p>
+            <w:pPr>
+              <w:spacing w:after="40"/>
+              <w:jc w:val="left"/>
+            </w:pPr>
+            <w:r>
+              <w:rPr>
+                <w:b/>
+                <w:bCs/>
+                <w:i w:val="false"/>
+                <w:iCs w:val="false"/>
+                <w:color w:val="000000"/>
+                <w:sz w:val="20"/>
+                <w:szCs w:val="20"/>
+                <w:rFonts w:ascii="Times New Roman" w:cs="Times New Roman" w:eastAsia="Times New Roman" w:hAnsi="Times New Roman"/>
+              </w:rPr>
+              <w:t xml:space="preserve">Pillage</w:t>
+            </w:r>
+          </w:p>
+        </w:tc>
+        <w:tc>
+          <w:tcPr>
+            <w:tcMar>
+              <w:top w:type="dxa" w:w="80"/>
+              <w:left w:type="dxa" w:w="80"/>
+              <w:bottom w:type="dxa" w:w="80"/>
+              <w:right w:type="dxa" w:w="80"/>
+            </w:tcMar>
+          </w:tcPr>
+          <w:p>
+            <w:pPr>
+              <w:spacing w:after="40"/>
+              <w:jc w:val="left"/>
+            </w:pPr>
+            <w:r>
+              <w:rPr>
+                <w:b w:val="false"/>
+                <w:bCs w:val="false"/>
+                <w:i w:val="false"/>
+                <w:iCs w:val="false"/>
+                <w:color w:val="000000"/>
+                <w:sz w:val="20"/>
+                <w:szCs w:val="20"/>
+                <w:rFonts w:ascii="Times New Roman" w:cs="Times New Roman" w:eastAsia="Times New Roman" w:hAnsi="Times New Roman"/>
+              </w:rPr>
+              <w:t xml:space="preserve">vol ou destruction de biens culturels</w:t>
+            </w:r>
+          </w:p>
+        </w:tc>
+      </w:tr>
+      <w:tr>
+        <w:tc>
+          <w:tcPr>
+            <w:tcMar>
+              <w:top w:type="dxa" w:w="80"/>
+              <w:left w:type="dxa" w:w="80"/>
+              <w:bottom w:type="dxa" w:w="80"/>
+              <w:right w:type="dxa" w:w="80"/>
+            </w:tcMar>
+          </w:tcPr>
+          <w:p>
+            <w:pPr>
+              <w:spacing w:after="40"/>
+              <w:jc w:val="left"/>
+            </w:pPr>
+            <w:r>
+              <w:rPr>
+                <w:b/>
+                <w:bCs/>
+                <w:i w:val="false"/>
+                <w:iCs w:val="false"/>
+                <w:color w:val="000000"/>
+                <w:sz w:val="20"/>
+                <w:szCs w:val="20"/>
+                <w:rFonts w:ascii="Times New Roman" w:cs="Times New Roman" w:eastAsia="Times New Roman" w:hAnsi="Times New Roman"/>
+              </w:rPr>
+              <w:t xml:space="preserve">Commémoration</w:t>
+            </w:r>
+          </w:p>
+        </w:tc>
+        <w:tc>
+          <w:tcPr>
+            <w:tcMar>
+              <w:top w:type="dxa" w:w="80"/>
+              <w:left w:type="dxa" w:w="80"/>
+              <w:bottom w:type="dxa" w:w="80"/>
+              <w:right w:type="dxa" w:w="80"/>
+            </w:tcMar>
+          </w:tcPr>
+          <w:p>
+            <w:pPr>
+              <w:spacing w:after="40"/>
+              <w:jc w:val="left"/>
+            </w:pPr>
+            <w:r>
+              <w:rPr>
+                <w:b w:val="false"/>
+                <w:bCs w:val="false"/>
+                <w:i w:val="false"/>
+                <w:iCs w:val="false"/>
+                <w:color w:val="000000"/>
+                <w:sz w:val="20"/>
+                <w:szCs w:val="20"/>
+                <w:rFonts w:ascii="Times New Roman" w:cs="Times New Roman" w:eastAsia="Times New Roman" w:hAnsi="Times New Roman"/>
+              </w:rPr>
+              <w:t xml:space="preserve">cérémonie entretenant le souvenir d’un événement</w:t>
+            </w:r>
+          </w:p>
+        </w:tc>
+      </w:tr>
+    </w:tbl>
+    <w:p>
+      <w:pPr>
+        <w:spacing w:after="120"/>
+      </w:pPr>
     </w:p>
     <w:p>
       <w:pPr>

</xml_diff>